<commit_message>
converter to docx with script
</commit_message>
<xml_diff>
--- a/new_page/final_revision/version_2/thesis.docx
+++ b/new_page/final_revision/version_2/thesis.docx
@@ -5131,7 +5131,7 @@
     <w:bookmarkEnd w:id="50"/>
     <w:bookmarkEnd w:id="51"/>
     <w:bookmarkEnd w:id="52"/>
-    <w:bookmarkStart w:id="83" w:name="implementation"/>
+    <w:bookmarkStart w:id="107" w:name="implementation"/>
     <w:p>
       <w:pPr>
         <w:pStyle w:val="Heading1"/>
@@ -5140,7 +5140,7 @@
         <w:t xml:space="preserve">Methodology</w:t>
       </w:r>
     </w:p>
-    <w:bookmarkStart w:id="56" w:name="X948d26873a38a7ff54fdf928bde42dcabbb9565"/>
+    <w:bookmarkStart w:id="62" w:name="X948d26873a38a7ff54fdf928bde42dcabbb9565"/>
     <w:p>
       <w:pPr>
         <w:pStyle w:val="Heading2"/>
@@ -5167,6 +5167,48 @@
               <w:pStyle w:val="Compact"/>
               <w:jc w:val="center"/>
             </w:pPr>
+            <w:r>
+              <w:drawing>
+                <wp:inline>
+                  <wp:extent cx="5334000" cy="317741"/>
+                  <wp:effectExtent b="0" l="0" r="0" t="0"/>
+                  <wp:docPr descr="" title="" id="54" name="Picture"/>
+                  <a:graphic>
+                    <a:graphicData uri="http://schemas.openxmlformats.org/drawingml/2006/picture">
+                      <pic:pic>
+                        <pic:nvPicPr>
+                          <pic:cNvPr descr="Figures/03_01_overview.png" id="55" name="Picture"/>
+                          <pic:cNvPicPr>
+                            <a:picLocks noChangeArrowheads="1" noChangeAspect="1"/>
+                          </pic:cNvPicPr>
+                        </pic:nvPicPr>
+                        <pic:blipFill>
+                          <a:blip r:embed="rId53"/>
+                          <a:stretch>
+                            <a:fillRect/>
+                          </a:stretch>
+                        </pic:blipFill>
+                        <pic:spPr bwMode="auto">
+                          <a:xfrm>
+                            <a:off x="0" y="0"/>
+                            <a:ext cx="5334000" cy="317741"/>
+                          </a:xfrm>
+                          <a:prstGeom prst="rect">
+                            <a:avLst/>
+                          </a:prstGeom>
+                          <a:noFill/>
+                          <a:ln w="9525">
+                            <a:noFill/>
+                            <a:headEnd/>
+                            <a:tailEnd/>
+                          </a:ln>
+                        </pic:spPr>
+                      </pic:pic>
+                    </a:graphicData>
+                  </a:graphic>
+                </wp:inline>
+              </w:drawing>
+            </w:r>
           </w:p>
         </w:tc>
       </w:tr>
@@ -5227,7 +5269,7 @@
         <w:t xml:space="preserve">At the level of research questions, the methodology addresses four linked goals: transforming PDFs into structured ESG evidence, defining aspect-pillar-sentiment-tone schema, comparing tone with ClimateBERT-style labels, and diagnosing instability or failure modes across prompts and models. Reproducibility and provenance are treated as thesis-wide support conditions for those four goals rather than as standalone research questions. Chapter 3 therefore focuses not on a single classifier in isolation, but on a complete methodological system that turns raw disclosures into auditable research evidence.</w:t>
       </w:r>
     </w:p>
-    <w:bookmarkStart w:id="54" w:name="system-architecture"/>
+    <w:bookmarkStart w:id="60" w:name="system-architecture"/>
     <w:p>
       <w:pPr>
         <w:pStyle w:val="Heading3"/>
@@ -5242,140 +5284,6 @@
       </w:pPr>
       <w:r>
         <w:t xml:space="preserve">The repository documentation defines the workflow as an end-to-end research-data pipeline. Its operational architecture can be summarized as follows.</w:t>
-      </w:r>
-    </w:p>
-    <w:tbl>
-      <w:tblPr>
-        <w:tblStyle w:val="FigureTable"/>
-        <w:tblW w:type="auto" w:w="0"/>
-        <w:tblLook w:firstRow="0" w:lastRow="0" w:firstColumn="0" w:lastColumn="0"/>
-        <w:jc w:val="center"/>
-      </w:tblPr>
-      <w:tblGrid>
-        <w:gridCol w:w="3960"/>
-        <w:gridCol w:w="3960"/>
-      </w:tblGrid>
-      <w:tr>
-        <w:tc>
-          <w:tcPr/>
-          <w:p>
-            <w:pPr>
-              <w:pStyle w:val="Compact"/>
-              <w:jc w:val="center"/>
-            </w:pPr>
-          </w:p>
-        </w:tc>
-        <w:tc>
-          <w:tcPr/>
-          <w:p>
-            <w:pPr>
-              <w:jc w:val="center"/>
-            </w:pPr>
-            <w:bookmarkStart w:id="53" w:name="fig:system_architecture"/>
-            <w:bookmarkEnd w:id="53"/>
-          </w:p>
-        </w:tc>
-      </w:tr>
-    </w:tbl>
-    <w:p>
-      <w:pPr>
-        <w:pStyle w:val="ImageCaption"/>
-      </w:pPr>
-      <w:r>
-        <w:t xml:space="preserve">Executable system architecture of the repository, rewritten from the repository’s Mermaid workflow documentation into a LaTeX-safe diagram.</w:t>
-      </w:r>
-    </w:p>
-    <w:p>
-      <w:pPr>
-        <w:pStyle w:val="BodyText"/>
-      </w:pPr>
-      <w:r>
-        <w:t xml:space="preserve">The OCR layer creates page-level markdown and OCR JSON under data/thesis_dataset/&lt;document&gt;/. The extraction layer uses prompts stored in prompt/ and writes structured outputs and raw responses into results/esg_records.json and results/background_llm_jobs/. The ground-truth and benchmark layer writes resumable JSONL outputs to results/t1_results.jsonl and results/t2_results.jsonl. The analysis layer then produces ontology coverage, failure modes, prompt stability, model stability, and greenwashing-oriented summaries in results/revision_analysis/ and results/thesis_workflow_dashboard/.</w:t>
-      </w:r>
-    </w:p>
-    <w:p>
-      <w:pPr>
-        <w:pStyle w:val="BodyText"/>
-      </w:pPr>
-      <w:r>
-        <w:t xml:space="preserve">This architecture is also reflected in the Streamlit surface. pages/Bulk_OCR.py manages ingestion, pages/llm_processing.py runs the combined T1-T2-T3 pipeline, pages/ground_truth.py manages resumable benchmark generation, pages/1_4_ClimateBERT_Record_Batch.py prepares one-to-one ClimateBERT comparison inputs, pages/1_6_Ontology_Path_Viewer.py inspects ontology assignments, and pages/1_0_Revision_Analytics.py consolidates diagnostics and stability evidence. The methodology chapter therefore describes a system that is both conceptual and executable.</w:t>
-      </w:r>
-    </w:p>
-    <w:bookmarkEnd w:id="54"/>
-    <w:bookmarkStart w:id="55" w:name="design-principles"/>
-    <w:p>
-      <w:pPr>
-        <w:pStyle w:val="Heading3"/>
-      </w:pPr>
-      <w:r>
-        <w:t xml:space="preserve">Design Principles</w:t>
-      </w:r>
-    </w:p>
-    <w:p>
-      <w:pPr>
-        <w:pStyle w:val="FirstParagraph"/>
-      </w:pPr>
-      <w:r>
-        <w:t xml:space="preserve">Five design principles guide the methodology.</w:t>
-      </w:r>
-    </w:p>
-    <w:p>
-      <w:pPr>
-        <w:pStyle w:val="BodyText"/>
-      </w:pPr>
-      <w:r>
-        <w:t xml:space="preserve">First, provenance is preserved at page and record level. Extracted outputs are always linked back to OCR-expanded documents and page markdown, and dedicated verifier pages exist to map structured statements back to their source pages.</w:t>
-      </w:r>
-    </w:p>
-    <w:p>
-      <w:pPr>
-        <w:pStyle w:val="BodyText"/>
-      </w:pPr>
-      <w:r>
-        <w:t xml:space="preserve">Second, the system favors modular comparison over single-model dependence. Prompt families, model families, rule-based logic, classical ML, and hybrid transformer-based components are all retained so disagreement can be inspected rather than hidden.</w:t>
-      </w:r>
-    </w:p>
-    <w:p>
-      <w:pPr>
-        <w:pStyle w:val="BodyText"/>
-      </w:pPr>
-      <w:r>
-        <w:t xml:space="preserve">Third, the pipeline is designed for bilingual robustness. Indonesian and English text may coexist within the same report or even the same segment, so the method uses multilingual preprocessing, bilingual prompts, and ontology resources that reduce cross-language drift.</w:t>
-      </w:r>
-    </w:p>
-    <w:p>
-      <w:pPr>
-        <w:pStyle w:val="BodyText"/>
-      </w:pPr>
-      <w:r>
-        <w:t xml:space="preserve">Fourth, the method prioritizes interpretability together with automation. Lexical triggers, ontology paths, record-level reasoning fields, and audit tables are kept because the thesis is not only measuring output counts but also evaluating whether the outputs are credible and explainable.</w:t>
-      </w:r>
-    </w:p>
-    <w:p>
-      <w:pPr>
-        <w:pStyle w:val="BodyText"/>
-      </w:pPr>
-      <w:r>
-        <w:t xml:space="preserve">Fifth, the workflow is reproducibility-oriented. Background jobs store status files and event logs, prompts are versioned as standalone markdown files, and dashboard outputs are exported into persistent result folders. This principle matters because the thesis relies on repeated reruns, prompt comparisons, and artifact regeneration rather than a single static experiment.</w:t>
-      </w:r>
-    </w:p>
-    <w:p>
-      <w:pPr>
-        <w:pStyle w:val="BodyText"/>
-      </w:pPr>
-      <w:r>
-        <w:t xml:space="preserve">These principles lead directly to later technical decisions: page batching instead of isolated page inference, JSONL resumability for benchmark runs, ontology alignment after extraction, and separate treatment of topic labels, tone labels, and sentiment polarity.</w:t>
-      </w:r>
-    </w:p>
-    <w:bookmarkEnd w:id="55"/>
-    <w:bookmarkEnd w:id="56"/>
-    <w:bookmarkStart w:id="60" w:name="data-sources"/>
-    <w:p>
-      <w:pPr>
-        <w:pStyle w:val="Heading2"/>
-      </w:pPr>
-      <w:r>
-        <w:t xml:space="preserve">Data Sources</w:t>
       </w:r>
     </w:p>
     <w:tbl>
@@ -5396,6 +5304,48 @@
               <w:pStyle w:val="Compact"/>
               <w:jc w:val="center"/>
             </w:pPr>
+            <w:r>
+              <w:drawing>
+                <wp:inline>
+                  <wp:extent cx="5334000" cy="443169"/>
+                  <wp:effectExtent b="0" l="0" r="0" t="0"/>
+                  <wp:docPr descr="" title="" id="57" name="Picture"/>
+                  <a:graphic>
+                    <a:graphicData uri="http://schemas.openxmlformats.org/drawingml/2006/picture">
+                      <pic:pic>
+                        <pic:nvPicPr>
+                          <pic:cNvPr descr="Figures/03_01_01_system_architecture.png" id="58" name="Picture"/>
+                          <pic:cNvPicPr>
+                            <a:picLocks noChangeArrowheads="1" noChangeAspect="1"/>
+                          </pic:cNvPicPr>
+                        </pic:nvPicPr>
+                        <pic:blipFill>
+                          <a:blip r:embed="rId56"/>
+                          <a:stretch>
+                            <a:fillRect/>
+                          </a:stretch>
+                        </pic:blipFill>
+                        <pic:spPr bwMode="auto">
+                          <a:xfrm>
+                            <a:off x="0" y="0"/>
+                            <a:ext cx="5334000" cy="443169"/>
+                          </a:xfrm>
+                          <a:prstGeom prst="rect">
+                            <a:avLst/>
+                          </a:prstGeom>
+                          <a:noFill/>
+                          <a:ln w="9525">
+                            <a:noFill/>
+                            <a:headEnd/>
+                            <a:tailEnd/>
+                          </a:ln>
+                        </pic:spPr>
+                      </pic:pic>
+                    </a:graphicData>
+                  </a:graphic>
+                </wp:inline>
+              </w:drawing>
+            </w:r>
           </w:p>
         </w:tc>
       </w:tr>
@@ -5405,7 +5355,24 @@
         <w:pStyle w:val="ImageCaption"/>
       </w:pPr>
       <w:r>
-        <w:t xml:space="preserve">Section-level diagram for the data-source stack used by the workflow.</w:t>
+        <w:t xml:space="preserve">Executable system architecture of the repository, rewritten from the repository’s Mermaid workflow documentation into a LaTeX-safe diagram.</w:t>
+      </w:r>
+      <w:r>
+        <w:t xml:space="preserve"> </w:t>
+      </w:r>
+      <w:r>
+        <w:t xml:space="preserve"> </w:t>
+      </w:r>
+      <w:hyperlink r:id="rId59">
+        <w:r>
+          <w:rPr>
+            <w:rStyle w:val="Hyperlink"/>
+          </w:rPr>
+          <w:t xml:space="preserve">CC BY 4.0</w:t>
+        </w:r>
+      </w:hyperlink>
+      <w:r>
+        <w:t xml:space="preserve">.</w:t>
       </w:r>
     </w:p>
     <w:p>
@@ -5413,7 +5380,7 @@
         <w:pStyle w:val="BodyText"/>
       </w:pPr>
       <w:r>
-        <w:t xml:space="preserve">The primary data source is a corpus of sustainability and annual report PDFs stored in data/thesis_pdf/. According to the repository-wide inspection documented in code_documentation.md, this directory contained 193 PDF files at the time of inspection. These files form the raw document-level source for the thesis workflow. They are complemented by a machine-expanded corpus in data/thesis_dataset/, which contained 189 OCR-processed document folders at inspection time. Each processed folder typically includes ocr_result.json, a pages/ directory with page-level markdown such as page_0001.md, and an images/ directory with extracted image crops.</w:t>
+        <w:t xml:space="preserve">The OCR layer creates page-level markdown and OCR JSON under data/thesis_dataset/&lt;document&gt;/. The extraction layer uses prompts stored in prompt/ and writes structured outputs and raw responses into results/esg_records.json and results/background_llm_jobs/. The ground-truth and benchmark layer writes resumable JSONL outputs to results/t1_results.jsonl and results/t2_results.jsonl. The analysis layer then produces ontology coverage, failure modes, prompt stability, model stability, and greenwashing-oriented summaries in results/revision_analysis/ and results/thesis_workflow_dashboard/.</w:t>
       </w:r>
     </w:p>
     <w:p>
@@ -5421,7 +5388,25 @@
         <w:pStyle w:val="BodyText"/>
       </w:pPr>
       <w:r>
-        <w:t xml:space="preserve">This dataset is appropriate for the research problem because the thesis studies how sustainability disclosures can be transformed into structured ESG evidence rather than how short isolated sentences can be classified in a clean benchmark setting. The corpus captures the real reporting environment: long reports, mixed Indonesian and English text, varied layout structure, numeric tables, narrative commitments, governance descriptions, and different sectoral vocabularies. That diversity is necessary for evaluating whether an ESG ABSA pipeline remains useful under realistic disclosure conditions.</w:t>
+        <w:t xml:space="preserve">This architecture is also reflected in the Streamlit surface. pages/Bulk_OCR.py manages ingestion, pages/llm_processing.py runs the combined T1-T2-T3 pipeline, pages/ground_truth.py manages resumable benchmark generation, pages/1_4_ClimateBERT_Record_Batch.py prepares one-to-one ClimateBERT comparison inputs, pages/1_6_Ontology_Path_Viewer.py inspects ontology assignments, and pages/1_0_Revision_Analytics.py consolidates diagnostics and stability evidence. The methodology chapter therefore describes a system that is both conceptual and executable.</w:t>
+      </w:r>
+    </w:p>
+    <w:bookmarkEnd w:id="60"/>
+    <w:bookmarkStart w:id="61" w:name="design-principles"/>
+    <w:p>
+      <w:pPr>
+        <w:pStyle w:val="Heading3"/>
+      </w:pPr>
+      <w:r>
+        <w:t xml:space="preserve">Design Principles</w:t>
+      </w:r>
+    </w:p>
+    <w:p>
+      <w:pPr>
+        <w:pStyle w:val="FirstParagraph"/>
+      </w:pPr>
+      <w:r>
+        <w:t xml:space="preserve">Five design principles guide the methodology.</w:t>
       </w:r>
     </w:p>
     <w:p>
@@ -5429,7 +5414,7 @@
         <w:pStyle w:val="BodyText"/>
       </w:pPr>
       <w:r>
-        <w:t xml:space="preserve">The dataset also supports the research questions directly. For RQ1, it provides raw PDFs and OCR-expanded page units. For RQ2 and RQ3, it provides disclosure text that can be converted into aspect, pillar, sentiment, tone, and ClimateBERT-style comparison labels. For RQ4, it provides enough variability to observe schema drift, missing labels, ontology gaps, and model/prompt instability.</w:t>
+        <w:t xml:space="preserve">First, provenance is preserved at page and record level. Extracted outputs are always linked back to OCR-expanded documents and page markdown, and dedicated verifier pages exist to map structured statements back to their source pages.</w:t>
       </w:r>
     </w:p>
     <w:p>
@@ -5437,24 +5422,7 @@
         <w:pStyle w:val="BodyText"/>
       </w:pPr>
       <w:r>
-        <w:t xml:space="preserve">The repository includes additional structured support data. data/idx_data.csv and data/stock_info/ provide company and sector context. data/ESG Score.xlsx functions as an external benchmark or lookup source rather than as a native pipeline artifact. The main ontology and analysis-side derived resources are stored under results/revision_analysis/, including ontology.json, ontology coverage tables, prompt stability summaries, failure-mode tables, and pilot annotation files. These resources are not raw data in the same sense as the PDFs, but they are methodological inputs because later stages depend on them for mapping, validation, and evaluation.</w:t>
-      </w:r>
-    </w:p>
-    <w:bookmarkStart w:id="57" w:name="technical-characteristics-and-sampling"/>
-    <w:p>
-      <w:pPr>
-        <w:pStyle w:val="Heading3"/>
-      </w:pPr>
-      <w:r>
-        <w:t xml:space="preserve">Technical Characteristics and Sampling</w:t>
-      </w:r>
-    </w:p>
-    <w:p>
-      <w:pPr>
-        <w:pStyle w:val="FirstParagraph"/>
-      </w:pPr>
-      <w:r>
-        <w:t xml:space="preserve">The raw source data is document-based, but the effective unit of downstream computation changes by stage. OCR produces document folders and page markdown. LLM extraction operates on page batches or page-level contextual chunks. Ground-truth and benchmark stages operate on text units derived from extracted records. Ontology mapping operates on extracted aspects and record-level texts. This multi-level structure is necessary because no single unit is sufficient for all tasks.</w:t>
+        <w:t xml:space="preserve">Second, the system favors modular comparison over single-model dependence. Prompt families, model families, rule-based logic, classical ML, and hybrid transformer-based components are all retained so disagreement can be inspected rather than hidden.</w:t>
       </w:r>
     </w:p>
     <w:p>
@@ -5462,7 +5430,7 @@
         <w:pStyle w:val="BodyText"/>
       </w:pPr>
       <w:r>
-        <w:t xml:space="preserve">The current workflow evidence snapshot reports 23 completed OCR documents covering about 5,512 pages, 332 extracted tone records, 2,074 T2 rows, 70 pilot labels, and 1,220 result artifacts. These numbers should be interpreted as the active experimental evidence layer used by the thesis dashboard, not as the total raw corpus size. In other words, the repository contains a larger raw and OCR-expanded inventory, while the dashboard snapshot represents the currently processed and thesis-integrated subset.</w:t>
+        <w:t xml:space="preserve">Third, the pipeline is designed for bilingual robustness. Indonesian and English text may coexist within the same report or even the same segment, so the method uses multilingual preprocessing, bilingual prompts, and ontology resources that reduce cross-language drift.</w:t>
       </w:r>
     </w:p>
     <w:p>
@@ -5470,25 +5438,7 @@
         <w:pStyle w:val="BodyText"/>
       </w:pPr>
       <w:r>
-        <w:t xml:space="preserve">Selection is therefore partly corpus-driven and partly workflow-driven. Reports are collected because they are relevant to Indonesian ESG disclosure analysis, but the final processed subset is also shaped by practical constraints such as OCR completion, page-batch processing, background job success, and the availability of downstream annotation and validation capacity. This is consistent with the repository design, which stores both large-scale source inventory and smaller thesis-ready evidence layers.</w:t>
-      </w:r>
-    </w:p>
-    <w:bookmarkEnd w:id="57"/>
-    <w:bookmarkStart w:id="58" w:name="Xe8849fcebccc35595263b65e2347cd613096ba2"/>
-    <w:p>
-      <w:pPr>
-        <w:pStyle w:val="Heading3"/>
-      </w:pPr>
-      <w:r>
-        <w:t xml:space="preserve">Inclusion, Exclusion, and Evidence-Layer Boundaries</w:t>
-      </w:r>
-    </w:p>
-    <w:p>
-      <w:pPr>
-        <w:pStyle w:val="FirstParagraph"/>
-      </w:pPr>
-      <w:r>
-        <w:t xml:space="preserve">The study uses different inclusion and exclusion logic at different stages, and these boundaries need to be stated explicitly because later evaluation claims depend on them. At document level, the broad inclusion target is Indonesian sustainability or annual reporting material available as machine-processable PDF files in the thesis corpus. Documents are excluded from the active experimental subset when OCR expansion is incomplete, page structure is too unstable for downstream use, or later extraction and audit stages have not yet produced reusable artifacts.</w:t>
+        <w:t xml:space="preserve">Fourth, the method prioritizes interpretability together with automation. Lexical triggers, ontology paths, record-level reasoning fields, and audit tables are kept because the thesis is not only measuring output counts but also evaluating whether the outputs are credible and explainable.</w:t>
       </w:r>
     </w:p>
     <w:p>
@@ -5496,7 +5446,7 @@
         <w:pStyle w:val="BodyText"/>
       </w:pPr>
       <w:r>
-        <w:t xml:space="preserve">At page and text-unit level, inclusion is based on usability for provenance-preserving extraction rather than on an assumption that every page contains ESG evidence. Pages may still enter OCR storage even if they later prove non-informative. In contrast, extracted-record evaluation excludes malformed outputs, explicit missing-tone failures for some downstream denominators, and records that cannot be aligned reliably enough for the specific comparison being reported. This means that the thesis uses several evidence layers rather than a single monolithic dataset: the raw PDF inventory, the OCR-expanded inventory, the active thesis-facing subset, and the smaller reviewed or comparison-ready subset used in specific tables.</w:t>
+        <w:t xml:space="preserve">Fifth, the workflow is reproducibility-oriented. Background jobs store status files and event logs, prompts are versioned as standalone markdown files, and dashboard outputs are exported into persistent result folders. This principle matters because the thesis relies on repeated reruns, prompt comparisons, and artifact regeneration rather than a single static experiment.</w:t>
       </w:r>
     </w:p>
     <w:p>
@@ -5504,52 +5454,18 @@
         <w:pStyle w:val="BodyText"/>
       </w:pPr>
       <w:r>
-        <w:t xml:space="preserve">The purpose of these boundaries is methodological transparency rather than aggressive filtering. The thesis does not claim that the current active subset is a statistically representative sample of all sustainability reports. Instead, it claims that this subset is sufficient to evaluate whether the implemented workflow can operate on long, noisy, bilingual reports and reveal its main strengths and weaknesses.</w:t>
-      </w:r>
-    </w:p>
-    <w:bookmarkEnd w:id="58"/>
-    <w:bookmarkStart w:id="59" w:name="ethics-bias-and-data-limitations"/>
-    <w:p>
-      <w:pPr>
-        <w:pStyle w:val="Heading3"/>
-      </w:pPr>
-      <w:r>
-        <w:t xml:space="preserve">Ethics, Bias, and Data Limitations</w:t>
-      </w:r>
-    </w:p>
-    <w:p>
-      <w:pPr>
-        <w:pStyle w:val="FirstParagraph"/>
-      </w:pPr>
-      <w:r>
-        <w:t xml:space="preserve">The corpus is based on corporate reports rather than private personal data, so the main ethical concerns are not individual privacy but rather licensing boundaries, faithful source tracing, and fair interpretation of corporate disclosures. The methodology mitigates evidential misuse by retaining provenance links from structured outputs back to report pages. This reduces the risk that generated records are discussed without access to their source context.</w:t>
-      </w:r>
-    </w:p>
-    <w:p>
-      <w:pPr>
-        <w:pStyle w:val="BodyText"/>
-      </w:pPr>
-      <w:r>
-        <w:t xml:space="preserve">Several biases remain. First, the corpus is biased toward firms that produce machine-accessible reports and toward sectors with stronger reporting practices. Second, environmental and governance language appears more strongly represented than social disclosures in the current evidence snapshot, which may affect downstream tone and aspect distributions. Third, bilingual and code-switched language can produce uneven extraction quality because the same disclosure function may be expressed differently across Indonesian and English segments. Fourth, prompt-dependent extraction can introduce representation bias if one template systematically omits certain fields.</w:t>
-      </w:r>
-    </w:p>
-    <w:p>
-      <w:pPr>
-        <w:pStyle w:val="BodyText"/>
-      </w:pPr>
-      <w:r>
-        <w:t xml:space="preserve">Data quality limitations are explicitly acknowledged in the repository. OCR noise, inconsistent formatting, page duplication, table fragmentation, and missing or unstable JSON fields can all affect downstream outputs. The thesis dashboard also notes a current need for stronger OCR baselines and formal manual validation. These limitations do not invalidate the workflow, but they do affect generalizability and motivate the use of diagnostics, review queues, and pilot annotation rather than overclaiming final benchmark performance.</w:t>
-      </w:r>
-    </w:p>
-    <w:bookmarkEnd w:id="59"/>
-    <w:bookmarkEnd w:id="60"/>
-    <w:bookmarkStart w:id="66" w:name="Xc9b43ace39fd8fa669ef83d2f7d20df1caf5a3e"/>
+        <w:t xml:space="preserve">These principles lead directly to later technical decisions: page batching instead of isolated page inference, JSONL resumability for benchmark runs, ontology alignment after extraction, and separate treatment of topic labels, tone labels, and sentiment polarity.</w:t>
+      </w:r>
+    </w:p>
+    <w:bookmarkEnd w:id="61"/>
+    <w:bookmarkEnd w:id="62"/>
+    <w:bookmarkStart w:id="69" w:name="data-sources"/>
     <w:p>
       <w:pPr>
         <w:pStyle w:val="Heading2"/>
       </w:pPr>
       <w:r>
-        <w:t xml:space="preserve">Data Collection and Preprocessing Pipeline</w:t>
+        <w:t xml:space="preserve">Data Sources</w:t>
       </w:r>
     </w:p>
     <w:tbl>
@@ -5570,6 +5486,48 @@
               <w:pStyle w:val="Compact"/>
               <w:jc w:val="center"/>
             </w:pPr>
+            <w:r>
+              <w:drawing>
+                <wp:inline>
+                  <wp:extent cx="5334000" cy="521900"/>
+                  <wp:effectExtent b="0" l="0" r="0" t="0"/>
+                  <wp:docPr descr="" title="" id="64" name="Picture"/>
+                  <a:graphic>
+                    <a:graphicData uri="http://schemas.openxmlformats.org/drawingml/2006/picture">
+                      <pic:pic>
+                        <pic:nvPicPr>
+                          <pic:cNvPr descr="Figures/03_02_data_sources.png" id="65" name="Picture"/>
+                          <pic:cNvPicPr>
+                            <a:picLocks noChangeArrowheads="1" noChangeAspect="1"/>
+                          </pic:cNvPicPr>
+                        </pic:nvPicPr>
+                        <pic:blipFill>
+                          <a:blip r:embed="rId63"/>
+                          <a:stretch>
+                            <a:fillRect/>
+                          </a:stretch>
+                        </pic:blipFill>
+                        <pic:spPr bwMode="auto">
+                          <a:xfrm>
+                            <a:off x="0" y="0"/>
+                            <a:ext cx="5334000" cy="521900"/>
+                          </a:xfrm>
+                          <a:prstGeom prst="rect">
+                            <a:avLst/>
+                          </a:prstGeom>
+                          <a:noFill/>
+                          <a:ln w="9525">
+                            <a:noFill/>
+                            <a:headEnd/>
+                            <a:tailEnd/>
+                          </a:ln>
+                        </pic:spPr>
+                      </pic:pic>
+                    </a:graphicData>
+                  </a:graphic>
+                </wp:inline>
+              </w:drawing>
+            </w:r>
           </w:p>
         </w:tc>
       </w:tr>
@@ -5579,7 +5537,7 @@
         <w:pStyle w:val="ImageCaption"/>
       </w:pPr>
       <w:r>
-        <w:t xml:space="preserve">Mermaid-derived preprocessing sequence from PDF ingestion to auditable ESG-ready text units.</w:t>
+        <w:t xml:space="preserve">Section-level diagram for the data-source stack used by the workflow.</w:t>
       </w:r>
     </w:p>
     <w:p>
@@ -5587,16 +5545,40 @@
         <w:pStyle w:val="BodyText"/>
       </w:pPr>
       <w:r>
-        <w:t xml:space="preserve">The preprocessing pipeline converts raw PDFs into analyzable page units and then into extraction-ready text batches. This stage is methodologically important because every later classifier or ontology mapper depends on the quality and structure of these intermediate artifacts.</w:t>
-      </w:r>
-    </w:p>
-    <w:bookmarkStart w:id="61" w:name="ocr-expansion-and-first-stage-extraction"/>
+        <w:t xml:space="preserve">The primary data source is a corpus of sustainability and annual report PDFs stored in data/thesis_pdf/. According to the repository-wide inspection documented in code_documentation.md, this directory contained 193 PDF files at the time of inspection. These files form the raw document-level source for the thesis workflow. They are complemented by a machine-expanded corpus in data/thesis_dataset/, which contained 189 OCR-processed document folders at inspection time. Each processed folder typically includes ocr_result.json, a pages/ directory with page-level markdown such as page_0001.md, and an images/ directory with extracted image crops.</w:t>
+      </w:r>
+    </w:p>
+    <w:p>
+      <w:pPr>
+        <w:pStyle w:val="BodyText"/>
+      </w:pPr>
+      <w:r>
+        <w:t xml:space="preserve">This dataset is appropriate for the research problem because the thesis studies how sustainability disclosures can be transformed into structured ESG evidence rather than how short isolated sentences can be classified in a clean benchmark setting. The corpus captures the real reporting environment: long reports, mixed Indonesian and English text, varied layout structure, numeric tables, narrative commitments, governance descriptions, and different sectoral vocabularies. That diversity is necessary for evaluating whether an ESG ABSA pipeline remains useful under realistic disclosure conditions.</w:t>
+      </w:r>
+    </w:p>
+    <w:p>
+      <w:pPr>
+        <w:pStyle w:val="BodyText"/>
+      </w:pPr>
+      <w:r>
+        <w:t xml:space="preserve">The dataset also supports the research questions directly. For RQ1, it provides raw PDFs and OCR-expanded page units. For RQ2 and RQ3, it provides disclosure text that can be converted into aspect, pillar, sentiment, tone, and ClimateBERT-style comparison labels. For RQ4, it provides enough variability to observe schema drift, missing labels, ontology gaps, and model/prompt instability.</w:t>
+      </w:r>
+    </w:p>
+    <w:p>
+      <w:pPr>
+        <w:pStyle w:val="BodyText"/>
+      </w:pPr>
+      <w:r>
+        <w:t xml:space="preserve">The repository includes additional structured support data. data/idx_data.csv and data/stock_info/ provide company and sector context. data/ESG Score.xlsx functions as an external benchmark or lookup source rather than as a native pipeline artifact. The main ontology and analysis-side derived resources are stored under results/revision_analysis/, including ontology.json, ontology coverage tables, prompt stability summaries, failure-mode tables, and pilot annotation files. These resources are not raw data in the same sense as the PDFs, but they are methodological inputs because later stages depend on them for mapping, validation, and evaluation.</w:t>
+      </w:r>
+    </w:p>
+    <w:bookmarkStart w:id="66" w:name="technical-characteristics-and-sampling"/>
     <w:p>
       <w:pPr>
         <w:pStyle w:val="Heading3"/>
       </w:pPr>
       <w:r>
-        <w:t xml:space="preserve">OCR Expansion and First-Stage Extraction</w:t>
+        <w:t xml:space="preserve">Technical Characteristics and Sampling</w:t>
       </w:r>
     </w:p>
     <w:p>
@@ -5604,7 +5586,7 @@
         <w:pStyle w:val="FirstParagraph"/>
       </w:pPr>
       <w:r>
-        <w:t xml:space="preserve">The first transformation is document OCR and structural extraction. The repository documents this stage through pages/Bulk_OCR.py, pages/1_2_OCR_Quality_Workbench.py, and the OCR-expanded folders in data/thesis_dataset/. Each processed report yields an ocr_result.json file containing page arrays and fields such as markdown text, images, tables, hyperlinks, dimensions, and confidence-related metadata. In parallel, the system writes page-level markdown files under pages/, which are the most commonly reused unit in downstream page audits and page-batch inference.</w:t>
+        <w:t xml:space="preserve">The raw source data is document-based, but the effective unit of downstream computation changes by stage. OCR produces document folders and page markdown. LLM extraction operates on page batches or page-level contextual chunks. Ground-truth and benchmark stages operate on text units derived from extracted records. Ontology mapping operates on extracted aspects and record-level texts. This multi-level structure is necessary because no single unit is sufficient for all tasks.</w:t>
       </w:r>
     </w:p>
     <w:p>
@@ -5612,17 +5594,25 @@
         <w:pStyle w:val="BodyText"/>
       </w:pPr>
       <w:r>
-        <w:t xml:space="preserve">The unit of analysis at this point is the page. This choice is appropriate because later provenance checks require the workflow to map structured ESG statements back to specific page files, and page-level markdown provides a stable and auditable representation of the original report. At the same time, the system does not restrict itself to single-page inference; page-level files can be grouped into page batches when additional context is needed.</w:t>
-      </w:r>
-    </w:p>
-    <w:bookmarkEnd w:id="61"/>
-    <w:bookmarkStart w:id="62" w:name="standardization-storage-and-tooling"/>
+        <w:t xml:space="preserve">The current workflow evidence snapshot reports 23 completed OCR documents covering about 5,512 pages, 332 extracted tone records, 2,074 T2 rows, 70 pilot labels, and 1,220 result artifacts. These numbers should be interpreted as the active experimental evidence layer used by the thesis dashboard, not as the total raw corpus size. In other words, the repository contains a larger raw and OCR-expanded inventory, while the dashboard snapshot represents the currently processed and thesis-integrated subset.</w:t>
+      </w:r>
+    </w:p>
+    <w:p>
+      <w:pPr>
+        <w:pStyle w:val="BodyText"/>
+      </w:pPr>
+      <w:r>
+        <w:t xml:space="preserve">Selection is therefore partly corpus-driven and partly workflow-driven. Reports are collected because they are relevant to Indonesian ESG disclosure analysis, but the final processed subset is also shaped by practical constraints such as OCR completion, page-batch processing, background job success, and the availability of downstream annotation and validation capacity. This is consistent with the repository design, which stores both large-scale source inventory and smaller thesis-ready evidence layers.</w:t>
+      </w:r>
+    </w:p>
+    <w:bookmarkEnd w:id="66"/>
+    <w:bookmarkStart w:id="67" w:name="Xe8849fcebccc35595263b65e2347cd613096ba2"/>
     <w:p>
       <w:pPr>
         <w:pStyle w:val="Heading3"/>
       </w:pPr>
       <w:r>
-        <w:t xml:space="preserve">Standardization, Storage, and Tooling</w:t>
+        <w:t xml:space="preserve">Inclusion, Exclusion, and Evidence-Layer Boundaries</w:t>
       </w:r>
     </w:p>
     <w:p>
@@ -5630,7 +5620,7 @@
         <w:pStyle w:val="FirstParagraph"/>
       </w:pPr>
       <w:r>
-        <w:t xml:space="preserve">The preprocessing outputs are standardized around a reproducible directory structure. Raw source PDFs remain in data/thesis_pdf/. OCR-expanded artifacts are stored in data/thesis_dataset/&lt;document&gt;/ocr_result.json, data/thesis_dataset/&lt;document&gt;/pages/, and data/thesis_dataset/&lt;document&gt;/images/. This structure allows downstream workers to resolve a document folder, inspect its pages, and trace extraction failures to specific files.</w:t>
+        <w:t xml:space="preserve">The study uses different inclusion and exclusion logic at different stages, and these boundaries need to be stated explicitly because later evaluation claims depend on them. At document level, the broad inclusion target is Indonesian sustainability or annual reporting material available as machine-processable PDF files in the thesis corpus. Documents are excluded from the active experimental subset when OCR expansion is incomplete, page structure is too unstable for downstream use, or later extraction and audit stages have not yet produced reusable artifacts.</w:t>
       </w:r>
     </w:p>
     <w:p>
@@ -5638,17 +5628,25 @@
         <w:pStyle w:val="BodyText"/>
       </w:pPr>
       <w:r>
-        <w:t xml:space="preserve">The methodological logic is also standardized in code. pages/llm_processing.py defines repository constants for the prompt directory, OCR output directory, results directory, and background-job directory. Background jobs are launched through code/llm_background_worker.py, while run state is preserved through status.json, control.json, and JSONL-like event logs under results/background_llm_jobs/. This storage logic is not incidental implementation detail; it is part of the reproducibility design because it ensures that extraction can be resumed, audited, and compared across runs.</w:t>
-      </w:r>
-    </w:p>
-    <w:bookmarkEnd w:id="62"/>
-    <w:bookmarkStart w:id="63" w:name="conversion-into-structured-esg-records"/>
+        <w:t xml:space="preserve">At page and text-unit level, inclusion is based on usability for provenance-preserving extraction rather than on an assumption that every page contains ESG evidence. Pages may still enter OCR storage even if they later prove non-informative. In contrast, extracted-record evaluation excludes malformed outputs, explicit missing-tone failures for some downstream denominators, and records that cannot be aligned reliably enough for the specific comparison being reported. This means that the thesis uses several evidence layers rather than a single monolithic dataset: the raw PDF inventory, the OCR-expanded inventory, the active thesis-facing subset, and the smaller reviewed or comparison-ready subset used in specific tables.</w:t>
+      </w:r>
+    </w:p>
+    <w:p>
+      <w:pPr>
+        <w:pStyle w:val="BodyText"/>
+      </w:pPr>
+      <w:r>
+        <w:t xml:space="preserve">The purpose of these boundaries is methodological transparency rather than aggressive filtering. The thesis does not claim that the current active subset is a statistically representative sample of all sustainability reports. Instead, it claims that this subset is sufficient to evaluate whether the implemented workflow can operate on long, noisy, bilingual reports and reveal its main strengths and weaknesses.</w:t>
+      </w:r>
+    </w:p>
+    <w:bookmarkEnd w:id="67"/>
+    <w:bookmarkStart w:id="68" w:name="ethics-bias-and-data-limitations"/>
     <w:p>
       <w:pPr>
         <w:pStyle w:val="Heading3"/>
       </w:pPr>
       <w:r>
-        <w:t xml:space="preserve">Conversion into Structured ESG Records</w:t>
+        <w:t xml:space="preserve">Ethics, Bias, and Data Limitations</w:t>
       </w:r>
     </w:p>
     <w:p>
@@ -5656,7 +5654,7 @@
         <w:pStyle w:val="FirstParagraph"/>
       </w:pPr>
       <w:r>
-        <w:t xml:space="preserve">After OCR, the next conversion is from page text into structured ESG records. In pages/llm_processing.py, the T3 extraction stage sends contextualized text to LLM backends and appends results to results/esg_records.json. Each run object can store metadata such as timestamp, model, target pages, prompt, success status, parsed records, raw output, and error information. When successful, record-level fields may include text, aspect, labels, esg, tone, sentiment, sentiment_score, and reasoning.</w:t>
+        <w:t xml:space="preserve">The corpus is based on corporate reports rather than private personal data, so the main ethical concerns are not individual privacy but rather licensing boundaries, faithful source tracing, and fair interpretation of corporate disclosures. The methodology mitigates evidential misuse by retaining provenance links from structured outputs back to report pages. This reduces the risk that generated records are discussed without access to their source context.</w:t>
       </w:r>
     </w:p>
     <w:p>
@@ -5664,25 +5662,7 @@
         <w:pStyle w:val="BodyText"/>
       </w:pPr>
       <w:r>
-        <w:t xml:space="preserve">This conversion stage is central to the methodology because it creates the canonical evidence layer used by the rest of the system. Instead of treating extracted text as an unstructured blob, the workflow transforms it into schema-bearing records that can later be benchmarked, filtered, aligned to ontology paths, or compared against ClimateBERT outputs.</w:t>
-      </w:r>
-    </w:p>
-    <w:bookmarkEnd w:id="63"/>
-    <w:bookmarkStart w:id="64" w:name="alignment-and-synchronization"/>
-    <w:p>
-      <w:pPr>
-        <w:pStyle w:val="Heading3"/>
-      </w:pPr>
-      <w:r>
-        <w:t xml:space="preserve">Alignment and Synchronization</w:t>
-      </w:r>
-    </w:p>
-    <w:p>
-      <w:pPr>
-        <w:pStyle w:val="FirstParagraph"/>
-      </w:pPr>
-      <w:r>
-        <w:t xml:space="preserve">The workflow combines several data layers that must be aligned after extraction. First, extracted records must remain linked to their source document and source pages. Second, T1 and T2 benchmark outputs must be aligned back to the record texts or labels they were derived from. Third, ontology mapping must connect extracted aspects to canonical ontology paths. Fourth, external comparison labels such as ClimateBERT-style outputs must preserve stable record identifiers for later agreement analysis.</w:t>
+        <w:t xml:space="preserve">Several biases remain. First, the corpus is biased toward firms that produce machine-accessible reports and toward sectors with stronger reporting practices. Second, environmental and governance language appears more strongly represented than social disclosures in the current evidence snapshot, which may affect downstream tone and aspect distributions. Third, bilingual and code-switched language can produce uneven extraction quality because the same disclosure function may be expressed differently across Indonesian and English segments. Fourth, prompt-dependent extraction can introduce representation bias if one template systematically omits certain fields.</w:t>
       </w:r>
     </w:p>
     <w:p>
@@ -5690,44 +5670,18 @@
         <w:pStyle w:val="BodyText"/>
       </w:pPr>
       <w:r>
-        <w:t xml:space="preserve">This alignment logic is visible in multiple parts of the repository. pages/2_2_LLM_Statement_Page_Verifier.py maps extracted statements back to OCR page markdown. pages/1_4_ClimateBERT_Record_Batch.py explicitly preserves record_id for one-to-one ClimateBERT comparison runs. code/data_alignment.py implements matching utilities for aligning reference labels, ABSA outputs, and benchmark outputs by text or related identifiers. The alignment unit therefore varies by task, but the underlying principle is stable: every derived label should remain recoverable to a concrete upstream artifact.</w:t>
-      </w:r>
-    </w:p>
-    <w:bookmarkEnd w:id="64"/>
-    <w:bookmarkStart w:id="65" w:name="preprocessing-quality-checks"/>
-    <w:p>
-      <w:pPr>
-        <w:pStyle w:val="Heading3"/>
-      </w:pPr>
-      <w:r>
-        <w:t xml:space="preserve">Preprocessing Quality Checks</w:t>
-      </w:r>
-    </w:p>
-    <w:p>
-      <w:pPr>
-        <w:pStyle w:val="FirstParagraph"/>
-      </w:pPr>
-      <w:r>
-        <w:t xml:space="preserve">The repository includes both manual and automated quality checks. Automated checks appear in OCR processing summaries, page processing audits, parse-success tables, and missing-field diagnostics. Manual checks are supported through Streamlit inspection pages such as the OCR quality workbench, page-level processing audit, statement-to-page verifier, and ground-truth review visualizers.</w:t>
-      </w:r>
-    </w:p>
-    <w:p>
-      <w:pPr>
-        <w:pStyle w:val="BodyText"/>
-      </w:pPr>
-      <w:r>
-        <w:t xml:space="preserve">The dashboard report indicates that OCR ingestion is operationally complete for the active subset, but it also notes the need for stronger semantic baselines such as page-count parity checks and small manually reviewed OCR samples. This is methodologically important: preprocessing quality is treated as a measured risk rather than an invisible assumption. The final preprocessed dataset is therefore not just the collection of OCR files, but the subset that passes through enough audit steps to be usable for extraction and benchmarking.</w:t>
-      </w:r>
-    </w:p>
-    <w:bookmarkEnd w:id="65"/>
-    <w:bookmarkEnd w:id="66"/>
-    <w:bookmarkStart w:id="72" w:name="X45fbc4713a0c4a5d5b05714efadfc5721d2b1aa"/>
+        <w:t xml:space="preserve">Data quality limitations are explicitly acknowledged in the repository. OCR noise, inconsistent formatting, page duplication, table fragmentation, and missing or unstable JSON fields can all affect downstream outputs. The thesis dashboard also notes a current need for stronger OCR baselines and formal manual validation. These limitations do not invalidate the workflow, but they do affect generalizability and motivate the use of diagnostics, review queues, and pilot annotation rather than overclaiming final benchmark performance.</w:t>
+      </w:r>
+    </w:p>
+    <w:bookmarkEnd w:id="68"/>
+    <w:bookmarkEnd w:id="69"/>
+    <w:bookmarkStart w:id="78" w:name="Xc9b43ace39fd8fa669ef83d2f7d20df1caf5a3e"/>
     <w:p>
       <w:pPr>
         <w:pStyle w:val="Heading2"/>
       </w:pPr>
       <w:r>
-        <w:t xml:space="preserve">Feature Extraction and Representation Learning</w:t>
+        <w:t xml:space="preserve">Data Collection and Preprocessing Pipeline</w:t>
       </w:r>
     </w:p>
     <w:tbl>
@@ -5748,6 +5702,48 @@
               <w:pStyle w:val="Compact"/>
               <w:jc w:val="center"/>
             </w:pPr>
+            <w:r>
+              <w:drawing>
+                <wp:inline>
+                  <wp:extent cx="5334000" cy="388525"/>
+                  <wp:effectExtent b="0" l="0" r="0" t="0"/>
+                  <wp:docPr descr="" title="" id="71" name="Picture"/>
+                  <a:graphic>
+                    <a:graphicData uri="http://schemas.openxmlformats.org/drawingml/2006/picture">
+                      <pic:pic>
+                        <pic:nvPicPr>
+                          <pic:cNvPr descr="Figures/03_02_02.png" id="72" name="Picture"/>
+                          <pic:cNvPicPr>
+                            <a:picLocks noChangeArrowheads="1" noChangeAspect="1"/>
+                          </pic:cNvPicPr>
+                        </pic:nvPicPr>
+                        <pic:blipFill>
+                          <a:blip r:embed="rId70"/>
+                          <a:stretch>
+                            <a:fillRect/>
+                          </a:stretch>
+                        </pic:blipFill>
+                        <pic:spPr bwMode="auto">
+                          <a:xfrm>
+                            <a:off x="0" y="0"/>
+                            <a:ext cx="5334000" cy="388525"/>
+                          </a:xfrm>
+                          <a:prstGeom prst="rect">
+                            <a:avLst/>
+                          </a:prstGeom>
+                          <a:noFill/>
+                          <a:ln w="9525">
+                            <a:noFill/>
+                            <a:headEnd/>
+                            <a:tailEnd/>
+                          </a:ln>
+                        </pic:spPr>
+                      </pic:pic>
+                    </a:graphicData>
+                  </a:graphic>
+                </wp:inline>
+              </w:drawing>
+            </w:r>
           </w:p>
         </w:tc>
       </w:tr>
@@ -5757,6 +5753,226 @@
         <w:pStyle w:val="ImageCaption"/>
       </w:pPr>
       <w:r>
+        <w:t xml:space="preserve">Mermaid-derived preprocessing sequence from PDF ingestion to auditable ESG-ready text units.</w:t>
+      </w:r>
+    </w:p>
+    <w:p>
+      <w:pPr>
+        <w:pStyle w:val="BodyText"/>
+      </w:pPr>
+      <w:r>
+        <w:t xml:space="preserve">The preprocessing pipeline converts raw PDFs into analyzable page units and then into extraction-ready text batches. This stage is methodologically important because every later classifier or ontology mapper depends on the quality and structure of these intermediate artifacts.</w:t>
+      </w:r>
+    </w:p>
+    <w:bookmarkStart w:id="73" w:name="ocr-expansion-and-first-stage-extraction"/>
+    <w:p>
+      <w:pPr>
+        <w:pStyle w:val="Heading3"/>
+      </w:pPr>
+      <w:r>
+        <w:t xml:space="preserve">OCR Expansion and First-Stage Extraction</w:t>
+      </w:r>
+    </w:p>
+    <w:p>
+      <w:pPr>
+        <w:pStyle w:val="FirstParagraph"/>
+      </w:pPr>
+      <w:r>
+        <w:t xml:space="preserve">The first transformation is document OCR and structural extraction. The repository documents this stage through pages/Bulk_OCR.py, pages/1_2_OCR_Quality_Workbench.py, and the OCR-expanded folders in data/thesis_dataset/. Each processed report yields an ocr_result.json file containing page arrays and fields such as markdown text, images, tables, hyperlinks, dimensions, and confidence-related metadata. In parallel, the system writes page-level markdown files under pages/, which are the most commonly reused unit in downstream page audits and page-batch inference.</w:t>
+      </w:r>
+    </w:p>
+    <w:p>
+      <w:pPr>
+        <w:pStyle w:val="BodyText"/>
+      </w:pPr>
+      <w:r>
+        <w:t xml:space="preserve">The unit of analysis at this point is the page. This choice is appropriate because later provenance checks require the workflow to map structured ESG statements back to specific page files, and page-level markdown provides a stable and auditable representation of the original report. At the same time, the system does not restrict itself to single-page inference; page-level files can be grouped into page batches when additional context is needed.</w:t>
+      </w:r>
+    </w:p>
+    <w:bookmarkEnd w:id="73"/>
+    <w:bookmarkStart w:id="74" w:name="standardization-storage-and-tooling"/>
+    <w:p>
+      <w:pPr>
+        <w:pStyle w:val="Heading3"/>
+      </w:pPr>
+      <w:r>
+        <w:t xml:space="preserve">Standardization, Storage, and Tooling</w:t>
+      </w:r>
+    </w:p>
+    <w:p>
+      <w:pPr>
+        <w:pStyle w:val="FirstParagraph"/>
+      </w:pPr>
+      <w:r>
+        <w:t xml:space="preserve">The preprocessing outputs are standardized around a reproducible directory structure. Raw source PDFs remain in data/thesis_pdf/. OCR-expanded artifacts are stored in data/thesis_dataset/&lt;document&gt;/ocr_result.json, data/thesis_dataset/&lt;document&gt;/pages/, and data/thesis_dataset/&lt;document&gt;/images/. This structure allows downstream workers to resolve a document folder, inspect its pages, and trace extraction failures to specific files.</w:t>
+      </w:r>
+    </w:p>
+    <w:p>
+      <w:pPr>
+        <w:pStyle w:val="BodyText"/>
+      </w:pPr>
+      <w:r>
+        <w:t xml:space="preserve">The methodological logic is also standardized in code. pages/llm_processing.py defines repository constants for the prompt directory, OCR output directory, results directory, and background-job directory. Background jobs are launched through code/llm_background_worker.py, while run state is preserved through status.json, control.json, and JSONL-like event logs under results/background_llm_jobs/. This storage logic is not incidental implementation detail; it is part of the reproducibility design because it ensures that extraction can be resumed, audited, and compared across runs.</w:t>
+      </w:r>
+    </w:p>
+    <w:bookmarkEnd w:id="74"/>
+    <w:bookmarkStart w:id="75" w:name="conversion-into-structured-esg-records"/>
+    <w:p>
+      <w:pPr>
+        <w:pStyle w:val="Heading3"/>
+      </w:pPr>
+      <w:r>
+        <w:t xml:space="preserve">Conversion into Structured ESG Records</w:t>
+      </w:r>
+    </w:p>
+    <w:p>
+      <w:pPr>
+        <w:pStyle w:val="FirstParagraph"/>
+      </w:pPr>
+      <w:r>
+        <w:t xml:space="preserve">After OCR, the next conversion is from page text into structured ESG records. In pages/llm_processing.py, the T3 extraction stage sends contextualized text to LLM backends and appends results to results/esg_records.json. Each run object can store metadata such as timestamp, model, target pages, prompt, success status, parsed records, raw output, and error information. When successful, record-level fields may include text, aspect, labels, esg, tone, sentiment, sentiment_score, and reasoning.</w:t>
+      </w:r>
+    </w:p>
+    <w:p>
+      <w:pPr>
+        <w:pStyle w:val="BodyText"/>
+      </w:pPr>
+      <w:r>
+        <w:t xml:space="preserve">This conversion stage is central to the methodology because it creates the canonical evidence layer used by the rest of the system. Instead of treating extracted text as an unstructured blob, the workflow transforms it into schema-bearing records that can later be benchmarked, filtered, aligned to ontology paths, or compared against ClimateBERT outputs.</w:t>
+      </w:r>
+    </w:p>
+    <w:bookmarkEnd w:id="75"/>
+    <w:bookmarkStart w:id="76" w:name="alignment-and-synchronization"/>
+    <w:p>
+      <w:pPr>
+        <w:pStyle w:val="Heading3"/>
+      </w:pPr>
+      <w:r>
+        <w:t xml:space="preserve">Alignment and Synchronization</w:t>
+      </w:r>
+    </w:p>
+    <w:p>
+      <w:pPr>
+        <w:pStyle w:val="FirstParagraph"/>
+      </w:pPr>
+      <w:r>
+        <w:t xml:space="preserve">The workflow combines several data layers that must be aligned after extraction. First, extracted records must remain linked to their source document and source pages. Second, T1 and T2 benchmark outputs must be aligned back to the record texts or labels they were derived from. Third, ontology mapping must connect extracted aspects to canonical ontology paths. Fourth, external comparison labels such as ClimateBERT-style outputs must preserve stable record identifiers for later agreement analysis.</w:t>
+      </w:r>
+    </w:p>
+    <w:p>
+      <w:pPr>
+        <w:pStyle w:val="BodyText"/>
+      </w:pPr>
+      <w:r>
+        <w:t xml:space="preserve">This alignment logic is visible in multiple parts of the repository. pages/2_2_LLM_Statement_Page_Verifier.py maps extracted statements back to OCR page markdown. pages/1_4_ClimateBERT_Record_Batch.py explicitly preserves record_id for one-to-one ClimateBERT comparison runs. code/data_alignment.py implements matching utilities for aligning reference labels, ABSA outputs, and benchmark outputs by text or related identifiers. The alignment unit therefore varies by task, but the underlying principle is stable: every derived label should remain recoverable to a concrete upstream artifact.</w:t>
+      </w:r>
+    </w:p>
+    <w:bookmarkEnd w:id="76"/>
+    <w:bookmarkStart w:id="77" w:name="preprocessing-quality-checks"/>
+    <w:p>
+      <w:pPr>
+        <w:pStyle w:val="Heading3"/>
+      </w:pPr>
+      <w:r>
+        <w:t xml:space="preserve">Preprocessing Quality Checks</w:t>
+      </w:r>
+    </w:p>
+    <w:p>
+      <w:pPr>
+        <w:pStyle w:val="FirstParagraph"/>
+      </w:pPr>
+      <w:r>
+        <w:t xml:space="preserve">The repository includes both manual and automated quality checks. Automated checks appear in OCR processing summaries, page processing audits, parse-success tables, and missing-field diagnostics. Manual checks are supported through Streamlit inspection pages such as the OCR quality workbench, page-level processing audit, statement-to-page verifier, and ground-truth review visualizers.</w:t>
+      </w:r>
+    </w:p>
+    <w:p>
+      <w:pPr>
+        <w:pStyle w:val="BodyText"/>
+      </w:pPr>
+      <w:r>
+        <w:t xml:space="preserve">The dashboard report indicates that OCR ingestion is operationally complete for the active subset, but it also notes the need for stronger semantic baselines such as page-count parity checks and small manually reviewed OCR samples. This is methodologically important: preprocessing quality is treated as a measured risk rather than an invisible assumption. The final preprocessed dataset is therefore not just the collection of OCR files, but the subset that passes through enough audit steps to be usable for extraction and benchmarking.</w:t>
+      </w:r>
+    </w:p>
+    <w:bookmarkEnd w:id="77"/>
+    <w:bookmarkEnd w:id="78"/>
+    <w:bookmarkStart w:id="87" w:name="X45fbc4713a0c4a5d5b05714efadfc5721d2b1aa"/>
+    <w:p>
+      <w:pPr>
+        <w:pStyle w:val="Heading2"/>
+      </w:pPr>
+      <w:r>
+        <w:t xml:space="preserve">Feature Extraction and Representation Learning</w:t>
+      </w:r>
+    </w:p>
+    <w:tbl>
+      <w:tblPr>
+        <w:tblStyle w:val="FigureTable"/>
+        <w:tblW w:type="auto" w:w="0"/>
+        <w:tblLook w:firstRow="0" w:lastRow="0" w:firstColumn="0" w:lastColumn="0"/>
+        <w:jc w:val="center"/>
+      </w:tblPr>
+      <w:tblGrid>
+        <w:gridCol w:w="7920"/>
+      </w:tblGrid>
+      <w:tr>
+        <w:tc>
+          <w:tcPr/>
+          <w:p>
+            <w:pPr>
+              <w:pStyle w:val="Compact"/>
+              <w:jc w:val="center"/>
+            </w:pPr>
+            <w:r>
+              <w:drawing>
+                <wp:inline>
+                  <wp:extent cx="5334000" cy="291933"/>
+                  <wp:effectExtent b="0" l="0" r="0" t="0"/>
+                  <wp:docPr descr="" title="" id="80" name="Picture"/>
+                  <a:graphic>
+                    <a:graphicData uri="http://schemas.openxmlformats.org/drawingml/2006/picture">
+                      <pic:pic>
+                        <pic:nvPicPr>
+                          <pic:cNvPr descr="Figures/03_04.png" id="81" name="Picture"/>
+                          <pic:cNvPicPr>
+                            <a:picLocks noChangeArrowheads="1" noChangeAspect="1"/>
+                          </pic:cNvPicPr>
+                        </pic:nvPicPr>
+                        <pic:blipFill>
+                          <a:blip r:embed="rId79"/>
+                          <a:stretch>
+                            <a:fillRect/>
+                          </a:stretch>
+                        </pic:blipFill>
+                        <pic:spPr bwMode="auto">
+                          <a:xfrm>
+                            <a:off x="0" y="0"/>
+                            <a:ext cx="5334000" cy="291933"/>
+                          </a:xfrm>
+                          <a:prstGeom prst="rect">
+                            <a:avLst/>
+                          </a:prstGeom>
+                          <a:noFill/>
+                          <a:ln w="9525">
+                            <a:noFill/>
+                            <a:headEnd/>
+                            <a:tailEnd/>
+                          </a:ln>
+                        </pic:spPr>
+                      </pic:pic>
+                    </a:graphicData>
+                  </a:graphic>
+                </wp:inline>
+              </w:drawing>
+            </w:r>
+          </w:p>
+        </w:tc>
+      </w:tr>
+    </w:tbl>
+    <w:p>
+      <w:pPr>
+        <w:pStyle w:val="ImageCaption"/>
+      </w:pPr>
+      <w:r>
         <w:t xml:space="preserve">Section-level diagram summarizing how explicit, sparse, contextual, and ontology-aware features are combined.</w:t>
       </w:r>
     </w:p>
@@ -5768,7 +5984,7 @@
         <w:t xml:space="preserve">Feature extraction in this study is multi-layered. Some features are explicit and interpretable, such as lexical triggers, aspect keywords, and ontology paths. Others are learned or semi-learned, such as TF-IDF vectors, transformer embeddings, and hybrid fused representations. The repository does not rely on one single feature philosophy; instead, it combines surface features and contextual features because ESG report language contains both formulaic disclosure patterns and semantically nuanced claims.</w:t>
       </w:r>
     </w:p>
-    <w:bookmarkStart w:id="67" w:name="overall-feature-strategy"/>
+    <w:bookmarkStart w:id="82" w:name="overall-feature-strategy"/>
     <w:p>
       <w:pPr>
         <w:pStyle w:val="Heading3"/>
@@ -5793,8 +6009,8 @@
         <w:t xml:space="preserve">These feature groups are connected directly to the research objective. Lexical features improve interpretability and provide a transparent baseline. Sparse features support classical machine learning comparisons. Contextual embeddings capture semantic variation across Indonesian, English, and mixed disclosures. Ontology and metadata features connect extracted outputs to ESG-specific interpretive structure and later evaluation tasks.</w:t>
       </w:r>
     </w:p>
-    <w:bookmarkEnd w:id="67"/>
-    <w:bookmarkStart w:id="68" w:name="rule-based-lexical-features"/>
+    <w:bookmarkEnd w:id="82"/>
+    <w:bookmarkStart w:id="83" w:name="rule-based-lexical-features"/>
     <w:p>
       <w:pPr>
         <w:pStyle w:val="Heading3"/>
@@ -5819,8 +6035,8 @@
         <w:t xml:space="preserve">This feature group is highly interpretable because every decision can be tied to a lexical trigger. The helper explain_rule_based_sentence() returns matched aspect, sentiment, and tone triggers for a sentence, which is useful for explainability outputs in later chapters. The limitation is that rule-based matching can be brittle, especially under bilingual phrasing, code-switching, implicit claims, or complex sentence structure.</w:t>
       </w:r>
     </w:p>
-    <w:bookmarkEnd w:id="68"/>
-    <w:bookmarkStart w:id="69" w:name="classical-sparse-text-features"/>
+    <w:bookmarkEnd w:id="83"/>
+    <w:bookmarkStart w:id="84" w:name="classical-sparse-text-features"/>
     <w:p>
       <w:pPr>
         <w:pStyle w:val="Heading3"/>
@@ -6046,8 +6262,8 @@
         <w:t xml:space="preserve">The predicted class is derived from the highest or thresholded score depending on the task. This representation is appropriate because it provides a strong, reproducible baseline and makes coefficient-based explanations possible. The code also includes local explanation logic that multiplies active feature values by model coefficients to show which terms contributed most strongly to a prediction.</w:t>
       </w:r>
     </w:p>
-    <w:bookmarkEnd w:id="69"/>
-    <w:bookmarkStart w:id="70" w:name="contextual-and-hybrid-representations"/>
+    <w:bookmarkEnd w:id="84"/>
+    <w:bookmarkStart w:id="85" w:name="contextual-and-hybrid-representations"/>
     <w:p>
       <w:pPr>
         <w:pStyle w:val="Heading3"/>
@@ -6354,8 +6570,8 @@
         <w:t xml:space="preserve">governance compliance section.</w:t>
       </w:r>
     </w:p>
-    <w:bookmarkEnd w:id="70"/>
-    <w:bookmarkStart w:id="71" w:name="ontology-based-feature-enhancement"/>
+    <w:bookmarkEnd w:id="85"/>
+    <w:bookmarkStart w:id="86" w:name="ontology-based-feature-enhancement"/>
     <w:p>
       <w:pPr>
         <w:pStyle w:val="Heading3"/>
@@ -6380,9 +6596,9 @@
         <w:t xml:space="preserve">This enhancement improves the representation in two ways. First, it regularizes semantically similar disclosures under common ESG concepts. Second, it makes outputs regulator-readable and more interpretable by mapping extracted aspects to structured paths rather than leaving them as free-text labels only. The main limitation is ontology scope: if an Indonesian-specific disclosure topic is absent from the current ontology resources, the mapping may still be incomplete or overly generic.</w:t>
       </w:r>
     </w:p>
-    <w:bookmarkEnd w:id="71"/>
-    <w:bookmarkEnd w:id="72"/>
-    <w:bookmarkStart w:id="76" w:name="proposed-framework"/>
+    <w:bookmarkEnd w:id="86"/>
+    <w:bookmarkEnd w:id="87"/>
+    <w:bookmarkStart w:id="94" w:name="proposed-framework"/>
     <w:p>
       <w:pPr>
         <w:pStyle w:val="Heading2"/>
@@ -6409,6 +6625,48 @@
               <w:pStyle w:val="Compact"/>
               <w:jc w:val="center"/>
             </w:pPr>
+            <w:r>
+              <w:drawing>
+                <wp:inline>
+                  <wp:extent cx="5334000" cy="285451"/>
+                  <wp:effectExtent b="0" l="0" r="0" t="0"/>
+                  <wp:docPr descr="" title="" id="89" name="Picture"/>
+                  <a:graphic>
+                    <a:graphicData uri="http://schemas.openxmlformats.org/drawingml/2006/picture">
+                      <pic:pic>
+                        <pic:nvPicPr>
+                          <pic:cNvPr descr="Figures/03_05.png" id="90" name="Picture"/>
+                          <pic:cNvPicPr>
+                            <a:picLocks noChangeArrowheads="1" noChangeAspect="1"/>
+                          </pic:cNvPicPr>
+                        </pic:nvPicPr>
+                        <pic:blipFill>
+                          <a:blip r:embed="rId88"/>
+                          <a:stretch>
+                            <a:fillRect/>
+                          </a:stretch>
+                        </pic:blipFill>
+                        <pic:spPr bwMode="auto">
+                          <a:xfrm>
+                            <a:off x="0" y="0"/>
+                            <a:ext cx="5334000" cy="285451"/>
+                          </a:xfrm>
+                          <a:prstGeom prst="rect">
+                            <a:avLst/>
+                          </a:prstGeom>
+                          <a:noFill/>
+                          <a:ln w="9525">
+                            <a:noFill/>
+                            <a:headEnd/>
+                            <a:tailEnd/>
+                          </a:ln>
+                        </pic:spPr>
+                      </pic:pic>
+                    </a:graphicData>
+                  </a:graphic>
+                </wp:inline>
+              </w:drawing>
+            </w:r>
           </w:p>
         </w:tc>
       </w:tr>
@@ -6429,7 +6687,7 @@
         <w:t xml:space="preserve">The proposed framework is not a single standalone classifier but a composite methodological system centered on a structured ESG evidence store. The extracted features described above are used in two main ways: first, to generate structured records from report text; second, to evaluate and refine those records through comparison, benchmarking, and ontology-aware analysis.</w:t>
       </w:r>
     </w:p>
-    <w:bookmarkStart w:id="73" w:name="X8073bf26f2ceb275fa7301f08bc64973d1a7194"/>
+    <w:bookmarkStart w:id="91" w:name="X8073bf26f2ceb275fa7301f08bc64973d1a7194"/>
     <w:p>
       <w:pPr>
         <w:pStyle w:val="Heading3"/>
@@ -6678,8 +6936,8 @@
         <w:t xml:space="preserve">audit rather than silently discarded.</w:t>
       </w:r>
     </w:p>
-    <w:bookmarkEnd w:id="73"/>
-    <w:bookmarkStart w:id="74" w:name="Xa9abde4898939241882d5f53ef2a9bb76d8f3dc"/>
+    <w:bookmarkEnd w:id="91"/>
+    <w:bookmarkStart w:id="92" w:name="Xa9abde4898939241882d5f53ef2a9bb76d8f3dc"/>
     <w:p>
       <w:pPr>
         <w:pStyle w:val="Heading3"/>
@@ -6712,8 +6970,8 @@
         <w:t xml:space="preserve">Evidence from multiple sources is then combined downstream. The workflow compares tone labels against ClimateBERT-style labels, maps extracted aspects to ontology paths, measures missing-tone and schema-drift rates, and preserves disagreement cases for manual review. The scoring logic is therefore not a single scalar objective but a collection of evidence-quality indicators: parse success, field completion, label agreement, ontology coverage, and failure-mode distribution.</w:t>
       </w:r>
     </w:p>
-    <w:bookmarkEnd w:id="74"/>
-    <w:bookmarkStart w:id="75" w:name="inference-and-output-mapping"/>
+    <w:bookmarkEnd w:id="92"/>
+    <w:bookmarkStart w:id="93" w:name="inference-and-output-mapping"/>
     <w:p>
       <w:pPr>
         <w:pStyle w:val="Heading3"/>
@@ -6738,9 +6996,9 @@
         <w:t xml:space="preserve">This mapping step is essential because the thesis aims to produce usable disclosure evidence rather than isolated classification scores. A predicted tone label has limited value if it cannot be tied back to a record, source page, ontology path, and comparison context. The implemented framework therefore treats output mapping as part of the methodological core.</w:t>
       </w:r>
     </w:p>
-    <w:bookmarkEnd w:id="75"/>
-    <w:bookmarkEnd w:id="76"/>
-    <w:bookmarkStart w:id="80" w:name="Xe2555432910901548b5e174f36a29cf5b668134"/>
+    <w:bookmarkEnd w:id="93"/>
+    <w:bookmarkEnd w:id="94"/>
+    <w:bookmarkStart w:id="101" w:name="Xe2555432910901548b5e174f36a29cf5b668134"/>
     <w:p>
       <w:pPr>
         <w:pStyle w:val="Heading2"/>
@@ -6767,6 +7025,48 @@
               <w:pStyle w:val="Compact"/>
               <w:jc w:val="center"/>
             </w:pPr>
+            <w:r>
+              <w:drawing>
+                <wp:inline>
+                  <wp:extent cx="5334000" cy="367592"/>
+                  <wp:effectExtent b="0" l="0" r="0" t="0"/>
+                  <wp:docPr descr="" title="" id="96" name="Picture"/>
+                  <a:graphic>
+                    <a:graphicData uri="http://schemas.openxmlformats.org/drawingml/2006/picture">
+                      <pic:pic>
+                        <pic:nvPicPr>
+                          <pic:cNvPr descr="Figures/03_06.png" id="97" name="Picture"/>
+                          <pic:cNvPicPr>
+                            <a:picLocks noChangeArrowheads="1" noChangeAspect="1"/>
+                          </pic:cNvPicPr>
+                        </pic:nvPicPr>
+                        <pic:blipFill>
+                          <a:blip r:embed="rId95"/>
+                          <a:stretch>
+                            <a:fillRect/>
+                          </a:stretch>
+                        </pic:blipFill>
+                        <pic:spPr bwMode="auto">
+                          <a:xfrm>
+                            <a:off x="0" y="0"/>
+                            <a:ext cx="5334000" cy="367592"/>
+                          </a:xfrm>
+                          <a:prstGeom prst="rect">
+                            <a:avLst/>
+                          </a:prstGeom>
+                          <a:noFill/>
+                          <a:ln w="9525">
+                            <a:noFill/>
+                            <a:headEnd/>
+                            <a:tailEnd/>
+                          </a:ln>
+                        </pic:spPr>
+                      </pic:pic>
+                    </a:graphicData>
+                  </a:graphic>
+                </wp:inline>
+              </w:drawing>
+            </w:r>
           </w:p>
         </w:tc>
       </w:tr>
@@ -6787,7 +7087,7 @@
         <w:t xml:space="preserve">True expert-labeled reference data does not yet exist for the full corpus. This is one of the central methodological constraints of the study, and the repository is designed around that constraint rather than ignoring it. The workflow therefore uses a layered reference strategy: weak labels from extraction outputs, benchmark outputs in JSONL form, pilot human annotation files, and comparison labels from ClimateBERT-style runs.</w:t>
       </w:r>
     </w:p>
-    <w:bookmarkStart w:id="77" w:name="X55fc61e9b65fd5cd26f7675d288d710b3739b5b"/>
+    <w:bookmarkStart w:id="98" w:name="X55fc61e9b65fd5cd26f7675d288d710b3739b5b"/>
     <w:p>
       <w:pPr>
         <w:pStyle w:val="Heading3"/>
@@ -6812,8 +7112,8 @@
         <w:t xml:space="preserve">The dashboard snapshot confirms this limitation. It reports 70 pilot labels and explicitly notes the need for stronger human-coded baselines, disagreement examples, and broader evaluation coverage. The methodology therefore treats reference construction as iterative: weak labels support early experimentation, pilot labels support focused validation, and future expansion can move toward a stronger stratified gold set.</w:t>
       </w:r>
     </w:p>
-    <w:bookmarkEnd w:id="77"/>
-    <w:bookmarkStart w:id="78" w:name="reference-generation-procedure"/>
+    <w:bookmarkEnd w:id="98"/>
+    <w:bookmarkStart w:id="99" w:name="reference-generation-procedure"/>
     <w:p>
       <w:pPr>
         <w:pStyle w:val="Heading3"/>
@@ -6846,8 +7146,8 @@
         <w:t xml:space="preserve">Human review enters through the pilot annotation files and review-oriented Streamlit pages. results/revision_analysis/pilot_ground_truth_seed.csv provides an annotation scaffold, while pilot_ground_truth_annotations.csv stores reviewed labels. These artifacts do not yet form a complete gold corpus, but they are sufficient to support targeted inspection, early agreement analysis, and the identification of difficult cases.</w:t>
       </w:r>
     </w:p>
-    <w:bookmarkEnd w:id="78"/>
-    <w:bookmarkStart w:id="79" w:name="X80e99514dd8777a89f13fbed59417c36cd8ea43"/>
+    <w:bookmarkEnd w:id="99"/>
+    <w:bookmarkStart w:id="100" w:name="X80e99514dd8777a89f13fbed59417c36cd8ea43"/>
     <w:p>
       <w:pPr>
         <w:pStyle w:val="Heading3"/>
@@ -6872,9 +7172,9 @@
         <w:t xml:space="preserve">The current reference layer nevertheless has important limitations. Weak labels remain model-dependent. Prompt sensitivity affects which records are extracted in the first place. OCR quality is operationally tracked but not yet fully benchmarked with formal CER or WER across the active subset. Ontology coverage, while strong in the current dashboard snapshot, still depends on the scope of the existing ontology resources. For these reasons, the study does not claim a finalized gold-standard benchmark. Instead, it claims an auditable and extensible reference-construction process suitable for iterative thesis research.</w:t>
       </w:r>
     </w:p>
-    <w:bookmarkEnd w:id="79"/>
-    <w:bookmarkEnd w:id="80"/>
-    <w:bookmarkStart w:id="81" w:name="Xaea31a0805e8448a088f307f565a5a00652de90"/>
+    <w:bookmarkEnd w:id="100"/>
+    <w:bookmarkEnd w:id="101"/>
+    <w:bookmarkStart w:id="102" w:name="Xaea31a0805e8448a088f307f565a5a00652de90"/>
     <w:p>
       <w:pPr>
         <w:pStyle w:val="Heading2"/>
@@ -6915,8 +7215,8 @@
         <w:t xml:space="preserve">Reproducibility is strong at the level of stored artifacts, prompts, logs, and resumable outputs, but weaker at the level of exact semantic reruns for third-party LLMs. Model availability, provider-side updates, and stochastic generation behavior can alter future outputs even when the repository preserves prompt files and artifact paths. For that reason, the thesis claims reproducible workflow structure and reproducible evidence storage more confidently than perfectly identical future outputs.</w:t>
       </w:r>
     </w:p>
-    <w:bookmarkEnd w:id="81"/>
-    <w:bookmarkStart w:id="82" w:name="summary"/>
+    <w:bookmarkEnd w:id="102"/>
+    <w:bookmarkStart w:id="106" w:name="summary"/>
     <w:p>
       <w:pPr>
         <w:pStyle w:val="Heading2"/>
@@ -6943,6 +7243,48 @@
               <w:pStyle w:val="Compact"/>
               <w:jc w:val="center"/>
             </w:pPr>
+            <w:r>
+              <w:drawing>
+                <wp:inline>
+                  <wp:extent cx="5334000" cy="440981"/>
+                  <wp:effectExtent b="0" l="0" r="0" t="0"/>
+                  <wp:docPr descr="" title="" id="104" name="Picture"/>
+                  <a:graphic>
+                    <a:graphicData uri="http://schemas.openxmlformats.org/drawingml/2006/picture">
+                      <pic:pic>
+                        <pic:nvPicPr>
+                          <pic:cNvPr descr="Figures/03_07_summary.png" id="105" name="Picture"/>
+                          <pic:cNvPicPr>
+                            <a:picLocks noChangeArrowheads="1" noChangeAspect="1"/>
+                          </pic:cNvPicPr>
+                        </pic:nvPicPr>
+                        <pic:blipFill>
+                          <a:blip r:embed="rId103"/>
+                          <a:stretch>
+                            <a:fillRect/>
+                          </a:stretch>
+                        </pic:blipFill>
+                        <pic:spPr bwMode="auto">
+                          <a:xfrm>
+                            <a:off x="0" y="0"/>
+                            <a:ext cx="5334000" cy="440981"/>
+                          </a:xfrm>
+                          <a:prstGeom prst="rect">
+                            <a:avLst/>
+                          </a:prstGeom>
+                          <a:noFill/>
+                          <a:ln w="9525">
+                            <a:noFill/>
+                            <a:headEnd/>
+                            <a:tailEnd/>
+                          </a:ln>
+                        </pic:spPr>
+                      </pic:pic>
+                    </a:graphicData>
+                  </a:graphic>
+                </wp:inline>
+              </w:drawing>
+            </w:r>
           </w:p>
         </w:tc>
       </w:tr>
@@ -6971,9 +7313,9 @@
         <w:t xml:space="preserve">Methodologically, the contribution of this design is not only that it automates extraction, but that it does so in a way that remains auditable, modular, bilingual-aware, and compatible with partial reference data. The next chapter can therefore focus on implementation and results using a clearly defined data flow, model structure, and evaluation reference layer grounded in the code and artifacts of the repository.</w:t>
       </w:r>
     </w:p>
-    <w:bookmarkEnd w:id="82"/>
-    <w:bookmarkEnd w:id="83"/>
-    <w:bookmarkStart w:id="103" w:name="experiments"/>
+    <w:bookmarkEnd w:id="106"/>
+    <w:bookmarkEnd w:id="107"/>
+    <w:bookmarkStart w:id="157" w:name="experiments"/>
     <w:p>
       <w:pPr>
         <w:pStyle w:val="Heading1"/>
@@ -6982,7 +7324,7 @@
         <w:t xml:space="preserve">Experiments</w:t>
       </w:r>
     </w:p>
-    <w:bookmarkStart w:id="87" w:name="experimental-scope-and-protocol"/>
+    <w:bookmarkStart w:id="111" w:name="experimental-scope-and-protocol"/>
     <w:p>
       <w:pPr>
         <w:pStyle w:val="Heading2"/>
@@ -6991,7 +7333,7 @@
         <w:t xml:space="preserve">Experimental Scope and Protocol</w:t>
       </w:r>
     </w:p>
-    <w:bookmarkStart w:id="84" w:name="Xd6abe8f938b9cb65b059493170ffccd15bbd4ec"/>
+    <w:bookmarkStart w:id="108" w:name="Xd6abe8f938b9cb65b059493170ffccd15bbd4ec"/>
     <w:p>
       <w:pPr>
         <w:pStyle w:val="Heading3"/>
@@ -7040,8 +7382,8 @@
         <w:t xml:space="preserve">This design follows directly from Chapter 3. The methodology argued that a mixed and modular evaluation strategy is more appropriate than a single-model setup because ESG reports are bilingual, structurally inconsistent, and prone to OCR and schema noise. The Chapter 4 implementation therefore tests both final output quality and engineering reliability.</w:t>
       </w:r>
     </w:p>
-    <w:bookmarkEnd w:id="84"/>
-    <w:bookmarkStart w:id="85" w:name="Xd58c6999ea98e4a2a2676fc14791e96f9c2fc72"/>
+    <w:bookmarkEnd w:id="108"/>
+    <w:bookmarkStart w:id="109" w:name="Xd58c6999ea98e4a2a2676fc14791e96f9c2fc72"/>
     <w:p>
       <w:pPr>
         <w:pStyle w:val="Heading3"/>
@@ -7090,8 +7432,8 @@
         <w:t xml:space="preserve">Reproducibility is one of the strongest implementation features of the codebase. The thesis dashboard report lists 1,220 result artifacts, 184 LLM background jobs, and persistent saved graph attachments. The repository explicitly states that visualizations can be regenerated by rerunning scripts such as code/visualize_tone_climatebert.py, while Streamlit pages such as 6_1_Chapter_4_Implementation_Results.py and 6_6_Chapter_4_Results_Visualizer.py provide live views over the same stored artifacts. The experiments are therefore reproducible in an engineering sense even where some semantic baselines remain incomplete.</w:t>
       </w:r>
     </w:p>
-    <w:bookmarkEnd w:id="85"/>
-    <w:bookmarkStart w:id="86" w:name="X01124b506b0550ea2cfe75b23ae7e7269982af2"/>
+    <w:bookmarkEnd w:id="109"/>
+    <w:bookmarkStart w:id="110" w:name="X01124b506b0550ea2cfe75b23ae7e7269982af2"/>
     <w:p>
       <w:pPr>
         <w:pStyle w:val="Heading3"/>
@@ -7116,9 +7458,9 @@
         <w:t xml:space="preserve">Comparison fairness is strongest when the same extracted text unit is preserved across later stages. This is the case for the main tone-versus-ClimateBERT comparison workflow, where record-level text and record identifiers are preserved for downstream comparison. By contrast, prompt and model comparisons should be interpreted as controlled configuration comparisons only when the same data slice and the same acceptance rules are held constant. Where those conditions are not perfectly fixed, the thesis treats the results as diagnostic evidence rather than as definitive head-to-head benchmark rankings.</w:t>
       </w:r>
     </w:p>
-    <w:bookmarkEnd w:id="86"/>
-    <w:bookmarkEnd w:id="87"/>
-    <w:bookmarkStart w:id="90" w:name="evaluation-metrics"/>
+    <w:bookmarkEnd w:id="110"/>
+    <w:bookmarkEnd w:id="111"/>
+    <w:bookmarkStart w:id="114" w:name="evaluation-metrics"/>
     <w:p>
       <w:pPr>
         <w:pStyle w:val="Heading2"/>
@@ -7127,7 +7469,7 @@
         <w:t xml:space="preserve">Evaluation Metrics</w:t>
       </w:r>
     </w:p>
-    <w:bookmarkStart w:id="88" w:name="primary-metrics"/>
+    <w:bookmarkStart w:id="112" w:name="primary-metrics"/>
     <w:p>
       <w:pPr>
         <w:pStyle w:val="Heading3"/>
@@ -7184,8 +7526,8 @@
         <w:t xml:space="preserve">For company-level interpretive risk, the greenwashing index is used as a task-specific ratio between commitment and outcome records at document level. Higher values indicate a stronger imbalance toward promises relative to reported outcomes. The metric is useful because it translates the tone taxonomy into an interpretable governance and disclosure-risk signal, but it remains heuristic and is not yet externally validated.</w:t>
       </w:r>
     </w:p>
-    <w:bookmarkEnd w:id="88"/>
-    <w:bookmarkStart w:id="89" w:name="secondary-and-complementary-metrics"/>
+    <w:bookmarkEnd w:id="112"/>
+    <w:bookmarkStart w:id="113" w:name="secondary-and-complementary-metrics"/>
     <w:p>
       <w:pPr>
         <w:pStyle w:val="Heading3"/>
@@ -7234,9 +7576,9 @@
         <w:t xml:space="preserve">Taken together, these metrics provide a more complete evaluation frame. OCR metrics measure operational readiness. Parse and completion metrics measure extraction usability. Agreement metrics measure construct overlap. Ontology coverage measures semantic mapping readiness. Stability metrics measure robustness. Failure modes measure weakness concentration. Greenwashing ratios and lexical triggers provide task-specific interpretation beyond generic accuracy.</w:t>
       </w:r>
     </w:p>
-    <w:bookmarkEnd w:id="89"/>
-    <w:bookmarkEnd w:id="90"/>
-    <w:bookmarkStart w:id="98" w:name="experimental-results"/>
+    <w:bookmarkEnd w:id="113"/>
+    <w:bookmarkEnd w:id="114"/>
+    <w:bookmarkStart w:id="146" w:name="experimental-results"/>
     <w:p>
       <w:pPr>
         <w:pStyle w:val="Heading2"/>
@@ -7245,7 +7587,7 @@
         <w:t xml:space="preserve">Experimental Results</w:t>
       </w:r>
     </w:p>
-    <w:bookmarkStart w:id="92" w:name="rq1-esg-absa-schema"/>
+    <w:bookmarkStart w:id="125" w:name="rq1-esg-absa-schema"/>
     <w:p>
       <w:pPr>
         <w:pStyle w:val="Heading3"/>
@@ -7332,6 +7674,48 @@
               <w:pStyle w:val="Compact"/>
               <w:jc w:val="center"/>
             </w:pPr>
+            <w:r>
+              <w:drawing>
+                <wp:inline>
+                  <wp:extent cx="5334000" cy="2358189"/>
+                  <wp:effectExtent b="0" l="0" r="0" t="0"/>
+                  <wp:docPr descr="" title="" id="116" name="Picture"/>
+                  <a:graphic>
+                    <a:graphicData uri="http://schemas.openxmlformats.org/drawingml/2006/picture">
+                      <pic:pic>
+                        <pic:nvPicPr>
+                          <pic:cNvPr descr="Figures/tone_distribution.png" id="117" name="Picture"/>
+                          <pic:cNvPicPr>
+                            <a:picLocks noChangeArrowheads="1" noChangeAspect="1"/>
+                          </pic:cNvPicPr>
+                        </pic:nvPicPr>
+                        <pic:blipFill>
+                          <a:blip r:embed="rId115"/>
+                          <a:stretch>
+                            <a:fillRect/>
+                          </a:stretch>
+                        </pic:blipFill>
+                        <pic:spPr bwMode="auto">
+                          <a:xfrm>
+                            <a:off x="0" y="0"/>
+                            <a:ext cx="5334000" cy="2358189"/>
+                          </a:xfrm>
+                          <a:prstGeom prst="rect">
+                            <a:avLst/>
+                          </a:prstGeom>
+                          <a:noFill/>
+                          <a:ln w="9525">
+                            <a:noFill/>
+                            <a:headEnd/>
+                            <a:tailEnd/>
+                          </a:ln>
+                        </pic:spPr>
+                      </pic:pic>
+                    </a:graphicData>
+                  </a:graphic>
+                </wp:inline>
+              </w:drawing>
+            </w:r>
           </w:p>
         </w:tc>
       </w:tr>
@@ -7362,6 +7746,48 @@
               <w:pStyle w:val="Compact"/>
               <w:jc w:val="center"/>
             </w:pPr>
+            <w:r>
+              <w:drawing>
+                <wp:inline>
+                  <wp:extent cx="4267200" cy="2470484"/>
+                  <wp:effectExtent b="0" l="0" r="0" t="0"/>
+                  <wp:docPr descr="" title="" id="119" name="Picture"/>
+                  <a:graphic>
+                    <a:graphicData uri="http://schemas.openxmlformats.org/drawingml/2006/picture">
+                      <pic:pic>
+                        <pic:nvPicPr>
+                          <pic:cNvPr descr="Figures/esg_by_tone.png" id="120" name="Picture"/>
+                          <pic:cNvPicPr>
+                            <a:picLocks noChangeArrowheads="1" noChangeAspect="1"/>
+                          </pic:cNvPicPr>
+                        </pic:nvPicPr>
+                        <pic:blipFill>
+                          <a:blip r:embed="rId118"/>
+                          <a:stretch>
+                            <a:fillRect/>
+                          </a:stretch>
+                        </pic:blipFill>
+                        <pic:spPr bwMode="auto">
+                          <a:xfrm>
+                            <a:off x="0" y="0"/>
+                            <a:ext cx="4267200" cy="2470484"/>
+                          </a:xfrm>
+                          <a:prstGeom prst="rect">
+                            <a:avLst/>
+                          </a:prstGeom>
+                          <a:noFill/>
+                          <a:ln w="9525">
+                            <a:noFill/>
+                            <a:headEnd/>
+                            <a:tailEnd/>
+                          </a:ln>
+                        </pic:spPr>
+                      </pic:pic>
+                    </a:graphicData>
+                  </a:graphic>
+                </wp:inline>
+              </w:drawing>
+            </w:r>
           </w:p>
         </w:tc>
       </w:tr>
@@ -7393,7 +7819,7 @@
         <w:t xml:space="preserve">.</w:t>
       </w:r>
     </w:p>
-    <w:bookmarkStart w:id="91" w:name="Xf5f4f6c25570f5680772b2fa0e2048832f80643"/>
+    <w:bookmarkStart w:id="121" w:name="Xf5f4f6c25570f5680772b2fa0e2048832f80643"/>
     <w:p>
       <w:pPr>
         <w:pStyle w:val="TableCaption"/>
@@ -8214,7 +8640,7 @@
         </w:tc>
       </w:tr>
     </w:tbl>
-    <w:bookmarkEnd w:id="91"/>
+    <w:bookmarkEnd w:id="121"/>
     <w:p>
       <w:pPr>
         <w:pStyle w:val="BodyText"/>
@@ -8271,6 +8697,48 @@
               <w:pStyle w:val="Compact"/>
               <w:jc w:val="center"/>
             </w:pPr>
+            <w:r>
+              <w:drawing>
+                <wp:inline>
+                  <wp:extent cx="5334000" cy="3930315"/>
+                  <wp:effectExtent b="0" l="0" r="0" t="0"/>
+                  <wp:docPr descr="" title="" id="123" name="Picture"/>
+                  <a:graphic>
+                    <a:graphicData uri="http://schemas.openxmlformats.org/drawingml/2006/picture">
+                      <pic:pic>
+                        <pic:nvPicPr>
+                          <pic:cNvPr descr="Figures/aspect_by_tone_heatmap.png" id="124" name="Picture"/>
+                          <pic:cNvPicPr>
+                            <a:picLocks noChangeArrowheads="1" noChangeAspect="1"/>
+                          </pic:cNvPicPr>
+                        </pic:nvPicPr>
+                        <pic:blipFill>
+                          <a:blip r:embed="rId122"/>
+                          <a:stretch>
+                            <a:fillRect/>
+                          </a:stretch>
+                        </pic:blipFill>
+                        <pic:spPr bwMode="auto">
+                          <a:xfrm>
+                            <a:off x="0" y="0"/>
+                            <a:ext cx="5334000" cy="3930315"/>
+                          </a:xfrm>
+                          <a:prstGeom prst="rect">
+                            <a:avLst/>
+                          </a:prstGeom>
+                          <a:noFill/>
+                          <a:ln w="9525">
+                            <a:noFill/>
+                            <a:headEnd/>
+                            <a:tailEnd/>
+                          </a:ln>
+                        </pic:spPr>
+                      </pic:pic>
+                    </a:graphicData>
+                  </a:graphic>
+                </wp:inline>
+              </w:drawing>
+            </w:r>
           </w:p>
         </w:tc>
       </w:tr>
@@ -8299,8 +8767,8 @@
         <w:t xml:space="preserve">Overall, RQ1 is answered positively within the current thesis scope. ESG disclosures can be represented through a record-level schema that integrates aspect, ESG pillar, sentiment, and tone, and that schema remains usable at realistic report scale. The main qualification is that class balance is uneven and tone completion remains more fragile than aspect or ontology coverage.</w:t>
       </w:r>
     </w:p>
-    <w:bookmarkEnd w:id="92"/>
-    <w:bookmarkStart w:id="94" w:name="rq2-tone-vs.-climate-specific-models"/>
+    <w:bookmarkEnd w:id="125"/>
+    <w:bookmarkStart w:id="130" w:name="rq2-tone-vs.-climate-specific-models"/>
     <w:p>
       <w:pPr>
         <w:pStyle w:val="Heading3"/>
@@ -8331,7 +8799,7 @@
         <w:t xml:space="preserve">summarizes the main agreement result.</w:t>
       </w:r>
     </w:p>
-    <w:bookmarkStart w:id="93" w:name="X340081145f249cf9b94466bb855ed3b4d280bbf"/>
+    <w:bookmarkStart w:id="126" w:name="X340081145f249cf9b94466bb855ed3b4d280bbf"/>
     <w:p>
       <w:pPr>
         <w:pStyle w:val="TableCaption"/>
@@ -8579,7 +9047,7 @@
         </w:tc>
       </w:tr>
     </w:tbl>
-    <w:bookmarkEnd w:id="93"/>
+    <w:bookmarkEnd w:id="126"/>
     <w:p>
       <w:pPr>
         <w:pStyle w:val="BodyText"/>
@@ -8642,6 +9110,48 @@
               <w:pStyle w:val="Compact"/>
               <w:jc w:val="center"/>
             </w:pPr>
+            <w:r>
+              <w:drawing>
+                <wp:inline>
+                  <wp:extent cx="5334000" cy="2578100"/>
+                  <wp:effectExtent b="0" l="0" r="0" t="0"/>
+                  <wp:docPr descr="" title="" id="128" name="Picture"/>
+                  <a:graphic>
+                    <a:graphicData uri="http://schemas.openxmlformats.org/drawingml/2006/picture">
+                      <pic:pic>
+                        <pic:nvPicPr>
+                          <pic:cNvPr descr="Figures/climatebert_label_by_tone.png" id="129" name="Picture"/>
+                          <pic:cNvPicPr>
+                            <a:picLocks noChangeArrowheads="1" noChangeAspect="1"/>
+                          </pic:cNvPicPr>
+                        </pic:nvPicPr>
+                        <pic:blipFill>
+                          <a:blip r:embed="rId127"/>
+                          <a:stretch>
+                            <a:fillRect/>
+                          </a:stretch>
+                        </pic:blipFill>
+                        <pic:spPr bwMode="auto">
+                          <a:xfrm>
+                            <a:off x="0" y="0"/>
+                            <a:ext cx="5334000" cy="2578100"/>
+                          </a:xfrm>
+                          <a:prstGeom prst="rect">
+                            <a:avLst/>
+                          </a:prstGeom>
+                          <a:noFill/>
+                          <a:ln w="9525">
+                            <a:noFill/>
+                            <a:headEnd/>
+                            <a:tailEnd/>
+                          </a:ln>
+                        </pic:spPr>
+                      </pic:pic>
+                    </a:graphicData>
+                  </a:graphic>
+                </wp:inline>
+              </w:drawing>
+            </w:r>
           </w:p>
         </w:tc>
       </w:tr>
@@ -8686,8 +9196,8 @@
         <w:t xml:space="preserve">Overall, RQ2 is answered positively but with a clear boundary. LLM-generated tone labels overlap meaningfully with specialized climate-oriented outputs, especially for commitment language, but they should not be treated as interchangeable with climate-topic classification. The comparison supports the validity of the tone taxonomy as an additional analytical layer rather than as a replacement for specialized climate models.</w:t>
       </w:r>
     </w:p>
-    <w:bookmarkEnd w:id="94"/>
-    <w:bookmarkStart w:id="96" w:name="rq3-pipeline-diagnostics"/>
+    <w:bookmarkEnd w:id="130"/>
+    <w:bookmarkStart w:id="138" w:name="rq3-pipeline-diagnostics"/>
     <w:p>
       <w:pPr>
         <w:pStyle w:val="Heading3"/>
@@ -8712,7 +9222,7 @@
         <w:t xml:space="preserve">The failure-mode count table is shown below.</w:t>
       </w:r>
     </w:p>
-    <w:bookmarkStart w:id="95" w:name="tab:failure-mode-count-table"/>
+    <w:bookmarkStart w:id="131" w:name="tab:failure-mode-count-table"/>
     <w:p>
       <w:pPr>
         <w:pStyle w:val="TableCaption"/>
@@ -9592,7 +10102,7 @@
         </w:tc>
       </w:tr>
     </w:tbl>
-    <w:bookmarkEnd w:id="95"/>
+    <w:bookmarkEnd w:id="131"/>
     <w:p>
       <w:pPr>
         <w:pStyle w:val="BodyText"/>
@@ -9627,6 +10137,48 @@
               <w:pStyle w:val="Compact"/>
               <w:jc w:val="center"/>
             </w:pPr>
+            <w:r>
+              <w:drawing>
+                <wp:inline>
+                  <wp:extent cx="5334000" cy="2933700"/>
+                  <wp:effectExtent b="0" l="0" r="0" t="0"/>
+                  <wp:docPr descr="" title="" id="133" name="Picture"/>
+                  <a:graphic>
+                    <a:graphicData uri="http://schemas.openxmlformats.org/drawingml/2006/picture">
+                      <pic:pic>
+                        <pic:nvPicPr>
+                          <pic:cNvPr descr="Figures/failure_mode_pareto.png" id="134" name="Picture"/>
+                          <pic:cNvPicPr>
+                            <a:picLocks noChangeArrowheads="1" noChangeAspect="1"/>
+                          </pic:cNvPicPr>
+                        </pic:nvPicPr>
+                        <pic:blipFill>
+                          <a:blip r:embed="rId132"/>
+                          <a:stretch>
+                            <a:fillRect/>
+                          </a:stretch>
+                        </pic:blipFill>
+                        <pic:spPr bwMode="auto">
+                          <a:xfrm>
+                            <a:off x="0" y="0"/>
+                            <a:ext cx="5334000" cy="2933700"/>
+                          </a:xfrm>
+                          <a:prstGeom prst="rect">
+                            <a:avLst/>
+                          </a:prstGeom>
+                          <a:noFill/>
+                          <a:ln w="9525">
+                            <a:noFill/>
+                            <a:headEnd/>
+                            <a:tailEnd/>
+                          </a:ln>
+                        </pic:spPr>
+                      </pic:pic>
+                    </a:graphicData>
+                  </a:graphic>
+                </wp:inline>
+              </w:drawing>
+            </w:r>
           </w:p>
         </w:tc>
       </w:tr>
@@ -9657,6 +10209,48 @@
               <w:pStyle w:val="Compact"/>
               <w:jc w:val="center"/>
             </w:pPr>
+            <w:r>
+              <w:drawing>
+                <wp:inline>
+                  <wp:extent cx="5334000" cy="5334000"/>
+                  <wp:effectExtent b="0" l="0" r="0" t="0"/>
+                  <wp:docPr descr="" title="" id="136" name="Picture"/>
+                  <a:graphic>
+                    <a:graphicData uri="http://schemas.openxmlformats.org/drawingml/2006/picture">
+                      <pic:pic>
+                        <pic:nvPicPr>
+                          <pic:cNvPr descr="Figures/failure_mode_pie.png" id="137" name="Picture"/>
+                          <pic:cNvPicPr>
+                            <a:picLocks noChangeArrowheads="1" noChangeAspect="1"/>
+                          </pic:cNvPicPr>
+                        </pic:nvPicPr>
+                        <pic:blipFill>
+                          <a:blip r:embed="rId135"/>
+                          <a:stretch>
+                            <a:fillRect/>
+                          </a:stretch>
+                        </pic:blipFill>
+                        <pic:spPr bwMode="auto">
+                          <a:xfrm>
+                            <a:off x="0" y="0"/>
+                            <a:ext cx="5334000" cy="5334000"/>
+                          </a:xfrm>
+                          <a:prstGeom prst="rect">
+                            <a:avLst/>
+                          </a:prstGeom>
+                          <a:noFill/>
+                          <a:ln w="9525">
+                            <a:noFill/>
+                            <a:headEnd/>
+                            <a:tailEnd/>
+                          </a:ln>
+                        </pic:spPr>
+                      </pic:pic>
+                    </a:graphicData>
+                  </a:graphic>
+                </wp:inline>
+              </w:drawing>
+            </w:r>
           </w:p>
         </w:tc>
       </w:tr>
@@ -9701,8 +10295,8 @@
         <w:t xml:space="preserve">Overall, RQ3 is answered directly by the diagnostic evidence. The most important failure modes are missing tone, schema drift, hedged or modal language, and layout- or terminology-related ambiguity. OCR processing is operational at document level, but the central downstream weakness remains tone stability rather than ontology coverage.</w:t>
       </w:r>
     </w:p>
-    <w:bookmarkEnd w:id="96"/>
-    <w:bookmarkStart w:id="97" w:name="rq4-stability-and-reproducibility"/>
+    <w:bookmarkEnd w:id="138"/>
+    <w:bookmarkStart w:id="145" w:name="rq4-stability-and-reproducibility"/>
     <w:p>
       <w:pPr>
         <w:pStyle w:val="Heading3"/>
@@ -10050,6 +10644,48 @@
               <w:pStyle w:val="Compact"/>
               <w:jc w:val="center"/>
             </w:pPr>
+            <w:r>
+              <w:drawing>
+                <wp:inline>
+                  <wp:extent cx="5334000" cy="3200400"/>
+                  <wp:effectExtent b="0" l="0" r="0" t="0"/>
+                  <wp:docPr descr="" title="" id="140" name="Picture"/>
+                  <a:graphic>
+                    <a:graphicData uri="http://schemas.openxmlformats.org/drawingml/2006/picture">
+                      <pic:pic>
+                        <pic:nvPicPr>
+                          <pic:cNvPr descr="Figures/model_tradeoff_scatter.png" id="141" name="Picture"/>
+                          <pic:cNvPicPr>
+                            <a:picLocks noChangeArrowheads="1" noChangeAspect="1"/>
+                          </pic:cNvPicPr>
+                        </pic:nvPicPr>
+                        <pic:blipFill>
+                          <a:blip r:embed="rId139"/>
+                          <a:stretch>
+                            <a:fillRect/>
+                          </a:stretch>
+                        </pic:blipFill>
+                        <pic:spPr bwMode="auto">
+                          <a:xfrm>
+                            <a:off x="0" y="0"/>
+                            <a:ext cx="5334000" cy="3200400"/>
+                          </a:xfrm>
+                          <a:prstGeom prst="rect">
+                            <a:avLst/>
+                          </a:prstGeom>
+                          <a:noFill/>
+                          <a:ln w="9525">
+                            <a:noFill/>
+                            <a:headEnd/>
+                            <a:tailEnd/>
+                          </a:ln>
+                        </pic:spPr>
+                      </pic:pic>
+                    </a:graphicData>
+                  </a:graphic>
+                </wp:inline>
+              </w:drawing>
+            </w:r>
           </w:p>
         </w:tc>
       </w:tr>
@@ -10110,6 +10746,48 @@
               <w:pStyle w:val="Compact"/>
               <w:jc w:val="center"/>
             </w:pPr>
+            <w:r>
+              <w:drawing>
+                <wp:inline>
+                  <wp:extent cx="5334000" cy="2004022"/>
+                  <wp:effectExtent b="0" l="0" r="0" t="0"/>
+                  <wp:docPr descr="" title="" id="143" name="Picture"/>
+                  <a:graphic>
+                    <a:graphicData uri="http://schemas.openxmlformats.org/drawingml/2006/picture">
+                      <pic:pic>
+                        <pic:nvPicPr>
+                          <pic:cNvPr descr="Figures/prompt_strategy_comparison.png" id="144" name="Picture"/>
+                          <pic:cNvPicPr>
+                            <a:picLocks noChangeArrowheads="1" noChangeAspect="1"/>
+                          </pic:cNvPicPr>
+                        </pic:nvPicPr>
+                        <pic:blipFill>
+                          <a:blip r:embed="rId142"/>
+                          <a:stretch>
+                            <a:fillRect/>
+                          </a:stretch>
+                        </pic:blipFill>
+                        <pic:spPr bwMode="auto">
+                          <a:xfrm>
+                            <a:off x="0" y="0"/>
+                            <a:ext cx="5334000" cy="2004022"/>
+                          </a:xfrm>
+                          <a:prstGeom prst="rect">
+                            <a:avLst/>
+                          </a:prstGeom>
+                          <a:noFill/>
+                          <a:ln w="9525">
+                            <a:noFill/>
+                            <a:headEnd/>
+                            <a:tailEnd/>
+                          </a:ln>
+                        </pic:spPr>
+                      </pic:pic>
+                    </a:graphicData>
+                  </a:graphic>
+                </wp:inline>
+              </w:drawing>
+            </w:r>
           </w:p>
         </w:tc>
       </w:tr>
@@ -10138,9 +10816,9 @@
         <w:t xml:space="preserve">Overall, RQ4 is answered with an important qualification. The workflow is reproducible and stable in an engineering sense because prompts, outputs, logs, and derived artifacts are stored persistently, and because the same evaluation views can be regenerated. However, semantic output stability is not uniform across prompts, models, or providers. Stability depends strongly on prompt design and schema-following behavior, so the thesis can claim reproducible workflow structure more confidently than universally stable model behavior.</w:t>
       </w:r>
     </w:p>
-    <w:bookmarkEnd w:id="97"/>
-    <w:bookmarkEnd w:id="98"/>
-    <w:bookmarkStart w:id="99" w:name="explainability-outputs"/>
+    <w:bookmarkEnd w:id="145"/>
+    <w:bookmarkEnd w:id="146"/>
+    <w:bookmarkStart w:id="153" w:name="explainability-outputs"/>
     <w:p>
       <w:pPr>
         <w:pStyle w:val="Heading2"/>
@@ -10191,6 +10869,48 @@
               <w:pStyle w:val="Compact"/>
               <w:jc w:val="center"/>
             </w:pPr>
+            <w:r>
+              <w:drawing>
+                <wp:inline>
+                  <wp:extent cx="4267200" cy="2607733"/>
+                  <wp:effectExtent b="0" l="0" r="0" t="0"/>
+                  <wp:docPr descr="" title="" id="148" name="Picture"/>
+                  <a:graphic>
+                    <a:graphicData uri="http://schemas.openxmlformats.org/drawingml/2006/picture">
+                      <pic:pic>
+                        <pic:nvPicPr>
+                          <pic:cNvPr descr="Figures/information_density_by_tone.png" id="149" name="Picture"/>
+                          <pic:cNvPicPr>
+                            <a:picLocks noChangeArrowheads="1" noChangeAspect="1"/>
+                          </pic:cNvPicPr>
+                        </pic:nvPicPr>
+                        <pic:blipFill>
+                          <a:blip r:embed="rId147"/>
+                          <a:stretch>
+                            <a:fillRect/>
+                          </a:stretch>
+                        </pic:blipFill>
+                        <pic:spPr bwMode="auto">
+                          <a:xfrm>
+                            <a:off x="0" y="0"/>
+                            <a:ext cx="4267200" cy="2607733"/>
+                          </a:xfrm>
+                          <a:prstGeom prst="rect">
+                            <a:avLst/>
+                          </a:prstGeom>
+                          <a:noFill/>
+                          <a:ln w="9525">
+                            <a:noFill/>
+                            <a:headEnd/>
+                            <a:tailEnd/>
+                          </a:ln>
+                        </pic:spPr>
+                      </pic:pic>
+                    </a:graphicData>
+                  </a:graphic>
+                </wp:inline>
+              </w:drawing>
+            </w:r>
           </w:p>
         </w:tc>
       </w:tr>
@@ -10221,6 +10941,48 @@
               <w:pStyle w:val="Compact"/>
               <w:jc w:val="center"/>
             </w:pPr>
+            <w:r>
+              <w:drawing>
+                <wp:inline>
+                  <wp:extent cx="4267200" cy="2607733"/>
+                  <wp:effectExtent b="0" l="0" r="0" t="0"/>
+                  <wp:docPr descr="" title="" id="151" name="Picture"/>
+                  <a:graphic>
+                    <a:graphicData uri="http://schemas.openxmlformats.org/drawingml/2006/picture">
+                      <pic:pic>
+                        <pic:nvPicPr>
+                          <pic:cNvPr descr="Figures/soft_language_ratio_by_tone.png" id="152" name="Picture"/>
+                          <pic:cNvPicPr>
+                            <a:picLocks noChangeArrowheads="1" noChangeAspect="1"/>
+                          </pic:cNvPicPr>
+                        </pic:nvPicPr>
+                        <pic:blipFill>
+                          <a:blip r:embed="rId150"/>
+                          <a:stretch>
+                            <a:fillRect/>
+                          </a:stretch>
+                        </pic:blipFill>
+                        <pic:spPr bwMode="auto">
+                          <a:xfrm>
+                            <a:off x="0" y="0"/>
+                            <a:ext cx="4267200" cy="2607733"/>
+                          </a:xfrm>
+                          <a:prstGeom prst="rect">
+                            <a:avLst/>
+                          </a:prstGeom>
+                          <a:noFill/>
+                          <a:ln w="9525">
+                            <a:noFill/>
+                            <a:headEnd/>
+                            <a:tailEnd/>
+                          </a:ln>
+                        </pic:spPr>
+                      </pic:pic>
+                    </a:graphicData>
+                  </a:graphic>
+                </wp:inline>
+              </w:drawing>
+            </w:r>
           </w:p>
         </w:tc>
       </w:tr>
@@ -10344,8 +11106,8 @@
         <w:t xml:space="preserve">These examples show that the tone taxonomy is meaningful in practice. The main challenge is not whether the categories are interpretable, but whether the extraction layer can assign them consistently across different prompts, models, and disclosure styles.</w:t>
       </w:r>
     </w:p>
-    <w:bookmarkEnd w:id="99"/>
-    <w:bookmarkStart w:id="100" w:name="X2c2236b70d55378651595040c469d1a562cf391"/>
+    <w:bookmarkEnd w:id="153"/>
+    <w:bookmarkStart w:id="154" w:name="X2c2236b70d55378651595040c469d1a562cf391"/>
     <w:p>
       <w:pPr>
         <w:pStyle w:val="Heading2"/>
@@ -10394,8 +11156,8 @@
         <w:t xml:space="preserve">Overall, the selected reference system is reliable enough for exploratory evaluation, disagreement analysis, and chapter-level empirical claims about patterns and failure modes. It is not yet reliable enough for definitive benchmark claims about absolute model superiority.</w:t>
       </w:r>
     </w:p>
-    <w:bookmarkEnd w:id="100"/>
-    <w:bookmarkStart w:id="101" w:name="comparative-component-analysis"/>
+    <w:bookmarkEnd w:id="154"/>
+    <w:bookmarkStart w:id="155" w:name="comparative-component-analysis"/>
     <w:p>
       <w:pPr>
         <w:pStyle w:val="Heading2"/>
@@ -10460,8 +11222,8 @@
         <w:t xml:space="preserve">An additional integrative Sankey-style visual can be added later if the export is generated from the visualizer, because it would summarize how the most frequent aspects distribute across commitment, action, and outcome in one compact view.</w:t>
       </w:r>
     </w:p>
-    <w:bookmarkEnd w:id="101"/>
-    <w:bookmarkStart w:id="102" w:name="chapter-synthesis"/>
+    <w:bookmarkEnd w:id="155"/>
+    <w:bookmarkStart w:id="156" w:name="chapter-synthesis"/>
     <w:p>
       <w:pPr>
         <w:pStyle w:val="Heading2"/>
@@ -10502,9 +11264,9 @@
         <w:t xml:space="preserve">These findings connect directly back to Chapter 3. The methodology emphasized modularity, provenance, bilingual robustness, and interpretability. Chapter 4 shows that these design choices were justified. The system works best when it preserves traceable intermediate artifacts, separates tone from sentiment, and treats disagreement as information rather than noise. These results also prepare the next chapter: the discussion can now interpret commitment dominance, governance-related tone failures, model disagreement, and ontology coverage as substantive findings rather than mere implementation artifacts.</w:t>
       </w:r>
     </w:p>
-    <w:bookmarkEnd w:id="102"/>
-    <w:bookmarkEnd w:id="103"/>
-    <w:bookmarkStart w:id="117" w:name="discussion"/>
+    <w:bookmarkEnd w:id="156"/>
+    <w:bookmarkEnd w:id="157"/>
+    <w:bookmarkStart w:id="181" w:name="discussion"/>
     <w:p>
       <w:pPr>
         <w:pStyle w:val="Heading1"/>
@@ -10513,7 +11275,7 @@
         <w:t xml:space="preserve">Discussion</w:t>
       </w:r>
     </w:p>
-    <w:bookmarkStart w:id="106" w:name="key-findings-and-synthesis"/>
+    <w:bookmarkStart w:id="162" w:name="key-findings-and-synthesis"/>
     <w:p>
       <w:pPr>
         <w:pStyle w:val="Heading2"/>
@@ -10522,7 +11284,7 @@
         <w:t xml:space="preserve">Key Findings and Synthesis</w:t>
       </w:r>
     </w:p>
-    <w:bookmarkStart w:id="104" w:name="main-findings-and-their-meaning"/>
+    <w:bookmarkStart w:id="160" w:name="main-findings-and-their-meaning"/>
     <w:p>
       <w:pPr>
         <w:pStyle w:val="Heading3"/>
@@ -10599,6 +11361,48 @@
               <w:pStyle w:val="Compact"/>
               <w:jc w:val="center"/>
             </w:pPr>
+            <w:r>
+              <w:drawing>
+                <wp:inline>
+                  <wp:extent cx="5334000" cy="2358189"/>
+                  <wp:effectExtent b="0" l="0" r="0" t="0"/>
+                  <wp:docPr descr="" title="" id="158" name="Picture"/>
+                  <a:graphic>
+                    <a:graphicData uri="http://schemas.openxmlformats.org/drawingml/2006/picture">
+                      <pic:pic>
+                        <pic:nvPicPr>
+                          <pic:cNvPr descr="Figures/tone_distribution.png" id="159" name="Picture"/>
+                          <pic:cNvPicPr>
+                            <a:picLocks noChangeArrowheads="1" noChangeAspect="1"/>
+                          </pic:cNvPicPr>
+                        </pic:nvPicPr>
+                        <pic:blipFill>
+                          <a:blip r:embed="rId115"/>
+                          <a:stretch>
+                            <a:fillRect/>
+                          </a:stretch>
+                        </pic:blipFill>
+                        <pic:spPr bwMode="auto">
+                          <a:xfrm>
+                            <a:off x="0" y="0"/>
+                            <a:ext cx="5334000" cy="2358189"/>
+                          </a:xfrm>
+                          <a:prstGeom prst="rect">
+                            <a:avLst/>
+                          </a:prstGeom>
+                          <a:noFill/>
+                          <a:ln w="9525">
+                            <a:noFill/>
+                            <a:headEnd/>
+                            <a:tailEnd/>
+                          </a:ln>
+                        </pic:spPr>
+                      </pic:pic>
+                    </a:graphicData>
+                  </a:graphic>
+                </wp:inline>
+              </w:drawing>
+            </w:r>
           </w:p>
         </w:tc>
       </w:tr>
@@ -10611,8 +11415,8 @@
         <w:t xml:space="preserve">Tone distribution in the active thesis-facing subset. This figure is used to interpret commitment dominance as a substantive disclosure pattern rather than as a descriptive count reported in Chapter 4.</w:t>
       </w:r>
     </w:p>
-    <w:bookmarkEnd w:id="104"/>
-    <w:bookmarkStart w:id="105" w:name="X04fae87cedd6fd90e60768d3f517ecb46be3407"/>
+    <w:bookmarkEnd w:id="160"/>
+    <w:bookmarkStart w:id="161" w:name="X04fae87cedd6fd90e60768d3f517ecb46be3407"/>
     <w:p>
       <w:pPr>
         <w:pStyle w:val="Heading3"/>
@@ -10971,9 +11775,9 @@
         <w:br/>
       </w:r>
     </w:p>
-    <w:bookmarkEnd w:id="105"/>
-    <w:bookmarkEnd w:id="106"/>
-    <w:bookmarkStart w:id="109" w:name="research-question-resolution"/>
+    <w:bookmarkEnd w:id="161"/>
+    <w:bookmarkEnd w:id="162"/>
+    <w:bookmarkStart w:id="167" w:name="research-question-resolution"/>
     <w:p>
       <w:pPr>
         <w:pStyle w:val="Heading2"/>
@@ -10982,7 +11786,7 @@
         <w:t xml:space="preserve">Research Question Resolution</w:t>
       </w:r>
     </w:p>
-    <w:bookmarkStart w:id="107" w:name="resolution-of-rq1-and-rq2"/>
+    <w:bookmarkStart w:id="163" w:name="resolution-of-rq1-and-rq2"/>
     <w:p>
       <w:pPr>
         <w:pStyle w:val="Heading3"/>
@@ -11007,8 +11811,8 @@
         <w:t xml:space="preserve">RQ2 asks whether the system can represent ESG disclosure beyond coarse topic detection by separating pillar, aspect, sentiment, and disclosure tone. The answer is also yes, but with an important qualification. The active result set shows meaningful distributions across tone and ESG pillar, with commitment as the dominant tone and environmental disclosure as the dominant pillar. This confirms that the schema can capture multiple dimensions of disclosure behavior. However, the pilot annotation evidence and the missing-tone cases show that this representation is not yet equally reliable across all text types. The contribution of RQ2 is therefore not only that the schema exists, but that the thesis demonstrates where it is robust and where it needs stronger human calibration.</w:t>
       </w:r>
     </w:p>
-    <w:bookmarkEnd w:id="107"/>
-    <w:bookmarkStart w:id="108" w:name="resolution-of-rq3-and-rq4"/>
+    <w:bookmarkEnd w:id="163"/>
+    <w:bookmarkStart w:id="166" w:name="resolution-of-rq3-and-rq4"/>
     <w:p>
       <w:pPr>
         <w:pStyle w:val="Heading3"/>
@@ -11043,6 +11847,48 @@
               <w:pStyle w:val="Compact"/>
               <w:jc w:val="center"/>
             </w:pPr>
+            <w:r>
+              <w:drawing>
+                <wp:inline>
+                  <wp:extent cx="5334000" cy="2578100"/>
+                  <wp:effectExtent b="0" l="0" r="0" t="0"/>
+                  <wp:docPr descr="" title="" id="164" name="Picture"/>
+                  <a:graphic>
+                    <a:graphicData uri="http://schemas.openxmlformats.org/drawingml/2006/picture">
+                      <pic:pic>
+                        <pic:nvPicPr>
+                          <pic:cNvPr descr="Figures/climatebert_label_by_tone.png" id="165" name="Picture"/>
+                          <pic:cNvPicPr>
+                            <a:picLocks noChangeArrowheads="1" noChangeAspect="1"/>
+                          </pic:cNvPicPr>
+                        </pic:nvPicPr>
+                        <pic:blipFill>
+                          <a:blip r:embed="rId127"/>
+                          <a:stretch>
+                            <a:fillRect/>
+                          </a:stretch>
+                        </pic:blipFill>
+                        <pic:spPr bwMode="auto">
+                          <a:xfrm>
+                            <a:off x="0" y="0"/>
+                            <a:ext cx="5334000" cy="2578100"/>
+                          </a:xfrm>
+                          <a:prstGeom prst="rect">
+                            <a:avLst/>
+                          </a:prstGeom>
+                          <a:noFill/>
+                          <a:ln w="9525">
+                            <a:noFill/>
+                            <a:headEnd/>
+                            <a:tailEnd/>
+                          </a:ln>
+                        </pic:spPr>
+                      </pic:pic>
+                    </a:graphicData>
+                  </a:graphic>
+                </wp:inline>
+              </w:drawing>
+            </w:r>
           </w:p>
         </w:tc>
       </w:tr>
@@ -11063,9 +11909,9 @@
         <w:t xml:space="preserve">RQ4 asks what weaknesses remain in the current evaluation and extraction strategy. The answer is that the major weaknesses are concentrated in tone omission, schema drift, and ambiguity-rich text. The strongest evidence is the 61 missing-tone cases, the 19 schema-drift cases in missing predictions, the hedged-or-modal-language failures, and the sensitivity of results to prompt and model choice. The proposed evaluation strategy is sufficient to reveal these weaknesses because it combines OCR completion, parse success, stability summaries, disagreement tables, ontology coverage, and review-oriented pilot files. However, it is not yet sufficient to claim final benchmark superiority because the gold-standard annotation layer remains limited. Taken together, the four RQs show that the thesis objective has been achieved at the level of an executable, interpretable, and diagnostically rich ESG disclosure-analysis framework.</w:t>
       </w:r>
     </w:p>
-    <w:bookmarkEnd w:id="108"/>
-    <w:bookmarkEnd w:id="109"/>
-    <w:bookmarkStart w:id="110" w:name="limitations"/>
+    <w:bookmarkEnd w:id="166"/>
+    <w:bookmarkEnd w:id="167"/>
+    <w:bookmarkStart w:id="174" w:name="limitations"/>
     <w:p>
       <w:pPr>
         <w:pStyle w:val="Heading2"/>
@@ -11140,6 +11986,48 @@
               <w:pStyle w:val="Compact"/>
               <w:jc w:val="center"/>
             </w:pPr>
+            <w:r>
+              <w:drawing>
+                <wp:inline>
+                  <wp:extent cx="5334000" cy="3368842"/>
+                  <wp:effectExtent b="0" l="0" r="0" t="0"/>
+                  <wp:docPr descr="" title="" id="169" name="Picture"/>
+                  <a:graphic>
+                    <a:graphicData uri="http://schemas.openxmlformats.org/drawingml/2006/picture">
+                      <pic:pic>
+                        <pic:nvPicPr>
+                          <pic:cNvPr descr="Figures/greenwashing_gap_scatter.png" id="170" name="Picture"/>
+                          <pic:cNvPicPr>
+                            <a:picLocks noChangeArrowheads="1" noChangeAspect="1"/>
+                          </pic:cNvPicPr>
+                        </pic:nvPicPr>
+                        <pic:blipFill>
+                          <a:blip r:embed="rId168"/>
+                          <a:stretch>
+                            <a:fillRect/>
+                          </a:stretch>
+                        </pic:blipFill>
+                        <pic:spPr bwMode="auto">
+                          <a:xfrm>
+                            <a:off x="0" y="0"/>
+                            <a:ext cx="5334000" cy="3368842"/>
+                          </a:xfrm>
+                          <a:prstGeom prst="rect">
+                            <a:avLst/>
+                          </a:prstGeom>
+                          <a:noFill/>
+                          <a:ln w="9525">
+                            <a:noFill/>
+                            <a:headEnd/>
+                            <a:tailEnd/>
+                          </a:ln>
+                        </pic:spPr>
+                      </pic:pic>
+                    </a:graphicData>
+                  </a:graphic>
+                </wp:inline>
+              </w:drawing>
+            </w:r>
           </w:p>
         </w:tc>
       </w:tr>
@@ -11170,6 +12058,48 @@
               <w:pStyle w:val="Compact"/>
               <w:jc w:val="center"/>
             </w:pPr>
+            <w:r>
+              <w:drawing>
+                <wp:inline>
+                  <wp:extent cx="5334000" cy="3012141"/>
+                  <wp:effectExtent b="0" l="0" r="0" t="0"/>
+                  <wp:docPr descr="" title="" id="172" name="Picture"/>
+                  <a:graphic>
+                    <a:graphicData uri="http://schemas.openxmlformats.org/drawingml/2006/picture">
+                      <pic:pic>
+                        <pic:nvPicPr>
+                          <pic:cNvPr descr="Figures/commitment_outcome_ratio.png" id="173" name="Picture"/>
+                          <pic:cNvPicPr>
+                            <a:picLocks noChangeArrowheads="1" noChangeAspect="1"/>
+                          </pic:cNvPicPr>
+                        </pic:nvPicPr>
+                        <pic:blipFill>
+                          <a:blip r:embed="rId171"/>
+                          <a:stretch>
+                            <a:fillRect/>
+                          </a:stretch>
+                        </pic:blipFill>
+                        <pic:spPr bwMode="auto">
+                          <a:xfrm>
+                            <a:off x="0" y="0"/>
+                            <a:ext cx="5334000" cy="3012141"/>
+                          </a:xfrm>
+                          <a:prstGeom prst="rect">
+                            <a:avLst/>
+                          </a:prstGeom>
+                          <a:noFill/>
+                          <a:ln w="9525">
+                            <a:noFill/>
+                            <a:headEnd/>
+                            <a:tailEnd/>
+                          </a:ln>
+                        </pic:spPr>
+                      </pic:pic>
+                    </a:graphicData>
+                  </a:graphic>
+                </wp:inline>
+              </w:drawing>
+            </w:r>
           </w:p>
         </w:tc>
       </w:tr>
@@ -11182,8 +12112,8 @@
         <w:t xml:space="preserve">Tone-share ratio chart for the active extracted-record layer. This figure supports the discussion claim that commitment-heavy evidence remains much more common than outcome-heavy evidence in the current subset.</w:t>
       </w:r>
     </w:p>
-    <w:bookmarkEnd w:id="110"/>
-    <w:bookmarkStart w:id="113" w:name="future-work"/>
+    <w:bookmarkEnd w:id="174"/>
+    <w:bookmarkStart w:id="177" w:name="future-work"/>
     <w:p>
       <w:pPr>
         <w:pStyle w:val="Heading2"/>
@@ -11192,7 +12122,7 @@
         <w:t xml:space="preserve">Future Work</w:t>
       </w:r>
     </w:p>
-    <w:bookmarkStart w:id="111" w:name="immediate-technical-extensions"/>
+    <w:bookmarkStart w:id="175" w:name="immediate-technical-extensions"/>
     <w:p>
       <w:pPr>
         <w:pStyle w:val="Heading3"/>
@@ -11241,8 +12171,8 @@
         <w:t xml:space="preserve">The fifth immediate improvement is better filtering of non-ESG and accounting-policy text. The pilot annotation files show examples where financial or accounting statements are correctly treated as none, but more explicit front-end filtering could reduce wasted extraction capacity and improve downstream quality.</w:t>
       </w:r>
     </w:p>
-    <w:bookmarkEnd w:id="111"/>
-    <w:bookmarkStart w:id="112" w:name="long-term-research-roadmap"/>
+    <w:bookmarkEnd w:id="175"/>
+    <w:bookmarkStart w:id="176" w:name="long-term-research-roadmap"/>
     <w:p>
       <w:pPr>
         <w:pStyle w:val="Heading3"/>
@@ -11321,9 +12251,9 @@
         <w:t xml:space="preserve">Taken together, these future directions form a coherent roadmap: first stabilize annotation and benchmarking, then improve model robustness and OCR quality, then extend across domains and deployment contexts, and finally integrate the workflow into broader evidence-centric research infrastructure.</w:t>
       </w:r>
     </w:p>
-    <w:bookmarkEnd w:id="112"/>
-    <w:bookmarkEnd w:id="113"/>
-    <w:bookmarkStart w:id="116" w:name="broader-impact"/>
+    <w:bookmarkEnd w:id="176"/>
+    <w:bookmarkEnd w:id="177"/>
+    <w:bookmarkStart w:id="180" w:name="broader-impact"/>
     <w:p>
       <w:pPr>
         <w:pStyle w:val="Heading2"/>
@@ -11332,7 +12262,7 @@
         <w:t xml:space="preserve">Broader Impact</w:t>
       </w:r>
     </w:p>
-    <w:bookmarkStart w:id="114" w:name="practical-and-societal-benefits"/>
+    <w:bookmarkStart w:id="178" w:name="practical-and-societal-benefits"/>
     <w:p>
       <w:pPr>
         <w:pStyle w:val="Heading3"/>
@@ -11365,8 +12295,8 @@
         <w:t xml:space="preserve">At societal level, the work supports stronger information transparency in sustainability communication. If deployed responsibly, a system like this can help identify when corporations communicate mostly aspiration, when they report concrete action, and when they document measurable outcomes. That distinction is valuable for accountability, sustainability governance, and public understanding of corporate climate and ESG claims.</w:t>
       </w:r>
     </w:p>
-    <w:bookmarkEnd w:id="114"/>
-    <w:bookmarkStart w:id="115" w:name="ethical-risks-bias-and-responsible-use"/>
+    <w:bookmarkEnd w:id="178"/>
+    <w:bookmarkStart w:id="179" w:name="ethical-risks-bias-and-responsible-use"/>
     <w:p>
       <w:pPr>
         <w:pStyle w:val="Heading3"/>
@@ -11415,10 +12345,10 @@
         <w:t xml:space="preserve">An additional deployment-oriented chart can still be added later if you export a reliability-adjusted waterfall or a qualitative case-study figure for one representative company. If used, the surrounding text must make clear that the output is illustrative and not a finalized evaluative instrument.</w:t>
       </w:r>
     </w:p>
-    <w:bookmarkEnd w:id="115"/>
-    <w:bookmarkEnd w:id="116"/>
-    <w:bookmarkEnd w:id="117"/>
-    <w:bookmarkStart w:id="118" w:name="summary"/>
+    <w:bookmarkEnd w:id="179"/>
+    <w:bookmarkEnd w:id="180"/>
+    <w:bookmarkEnd w:id="181"/>
+    <w:bookmarkStart w:id="182" w:name="summary"/>
     <w:p>
       <w:pPr>
         <w:pStyle w:val="Heading1"/>
@@ -11459,8 +12389,8 @@
         <w:t xml:space="preserve">The significance of the thesis is practical as well as academic. For researchers, it provides a reproducible basis for ESG disclosure analytics in a bilingual and low-resource setting. For analysts, regulators, and reporting teams, it offers a way to move from long PDF reports to structured, reviewable evidence without losing the connection to the source pages. More broadly, the work shows that useful ESG text analytics requires not only better models, but also better document engineering, provenance preservation, and evaluation design. In that sense, the thesis contributes an engineering-oriented foundation for more transparent and auditable sustainability-report analysis.</w:t>
       </w:r>
     </w:p>
-    <w:bookmarkEnd w:id="118"/>
-    <w:bookmarkStart w:id="190" w:name="appendices"/>
+    <w:bookmarkEnd w:id="182"/>
+    <w:bookmarkStart w:id="262" w:name="appendices"/>
     <w:p>
       <w:pPr>
         <w:pStyle w:val="Heading1"/>
@@ -11477,7 +12407,7 @@
         <w:t xml:space="preserve">This appendix chapter consolidates supplementary material that supports the methodological and reproducibility claims in the main thesis. The appendices are intended to document materials that are important for transparency but too detailed to place in the core chapter narrative.</w:t>
       </w:r>
     </w:p>
-    <w:bookmarkStart w:id="119" w:name="appendix-contents"/>
+    <w:bookmarkStart w:id="183" w:name="appendix-contents"/>
     <w:p>
       <w:pPr>
         <w:pStyle w:val="Heading2"/>
@@ -11571,8 +12501,8 @@
         <w:t xml:space="preserve">extended reproducibility notes for rerunning stored analyses.</w:t>
       </w:r>
     </w:p>
-    <w:bookmarkEnd w:id="119"/>
-    <w:bookmarkStart w:id="120" w:name="tone-label-definitions"/>
+    <w:bookmarkEnd w:id="183"/>
+    <w:bookmarkStart w:id="184" w:name="tone-label-definitions"/>
     <w:p>
       <w:pPr>
         <w:pStyle w:val="Heading2"/>
@@ -11673,8 +12603,8 @@
         <w:t xml:space="preserve">records whose language is too ambiguous, mixed, or incomplete for stable tone assignment without additional human interpretation.</w:t>
       </w:r>
     </w:p>
-    <w:bookmarkEnd w:id="120"/>
-    <w:bookmarkStart w:id="121" w:name="reproducibility-notes"/>
+    <w:bookmarkEnd w:id="184"/>
+    <w:bookmarkStart w:id="185" w:name="reproducibility-notes"/>
     <w:p>
       <w:pPr>
         <w:pStyle w:val="Heading2"/>
@@ -11829,8 +12759,8 @@
         <w:t xml:space="preserve">These artifacts support rerunning, auditing, and extending the workflow even where exact third-party LLM outputs may vary across time.</w:t>
       </w:r>
     </w:p>
-    <w:bookmarkEnd w:id="121"/>
-    <w:bookmarkStart w:id="133" w:name="end-to-end-user-workflow-diagram"/>
+    <w:bookmarkEnd w:id="185"/>
+    <w:bookmarkStart w:id="205" w:name="end-to-end-user-workflow-diagram"/>
     <w:p>
       <w:pPr>
         <w:pStyle w:val="Heading2"/>
@@ -11871,7 +12801,7 @@
         <w:t xml:space="preserve">, and then passes through the ClimateBERT comparison stage as the T1 pipeline.</w:t>
       </w:r>
     </w:p>
-    <w:bookmarkStart w:id="122" w:name="workflow-summary"/>
+    <w:bookmarkStart w:id="189" w:name="workflow-summary"/>
     <w:p>
       <w:pPr>
         <w:pStyle w:val="Heading3"/>
@@ -12130,6 +13060,48 @@
               <w:pStyle w:val="Compact"/>
               <w:jc w:val="center"/>
             </w:pPr>
+            <w:r>
+              <w:drawing>
+                <wp:inline>
+                  <wp:extent cx="5334000" cy="323564"/>
+                  <wp:effectExtent b="0" l="0" r="0" t="0"/>
+                  <wp:docPr descr="" title="" id="187" name="Picture"/>
+                  <a:graphic>
+                    <a:graphicData uri="http://schemas.openxmlformats.org/drawingml/2006/picture">
+                      <pic:pic>
+                        <pic:nvPicPr>
+                          <pic:cNvPr descr="Figures/mermaid_flow_diagram_01.png" id="188" name="Picture"/>
+                          <pic:cNvPicPr>
+                            <a:picLocks noChangeArrowheads="1" noChangeAspect="1"/>
+                          </pic:cNvPicPr>
+                        </pic:nvPicPr>
+                        <pic:blipFill>
+                          <a:blip r:embed="rId186"/>
+                          <a:stretch>
+                            <a:fillRect/>
+                          </a:stretch>
+                        </pic:blipFill>
+                        <pic:spPr bwMode="auto">
+                          <a:xfrm>
+                            <a:off x="0" y="0"/>
+                            <a:ext cx="5334000" cy="323564"/>
+                          </a:xfrm>
+                          <a:prstGeom prst="rect">
+                            <a:avLst/>
+                          </a:prstGeom>
+                          <a:noFill/>
+                          <a:ln w="9525">
+                            <a:noFill/>
+                            <a:headEnd/>
+                            <a:tailEnd/>
+                          </a:ln>
+                        </pic:spPr>
+                      </pic:pic>
+                    </a:graphicData>
+                  </a:graphic>
+                </wp:inline>
+              </w:drawing>
+            </w:r>
           </w:p>
         </w:tc>
       </w:tr>
@@ -12142,8 +13114,8 @@
         <w:t xml:space="preserve">Bulk OCR to LLM-processing flow diagram. This figure visualizes the operational path from file intake, OCR expansion, and page storage to provider-specific ESG extraction and downstream ClimateBERT comparison outputs.</w:t>
       </w:r>
     </w:p>
-    <w:bookmarkEnd w:id="122"/>
-    <w:bookmarkStart w:id="123" w:name="mermaid-sequence-diagram"/>
+    <w:bookmarkEnd w:id="189"/>
+    <w:bookmarkStart w:id="193" w:name="mermaid-sequence-diagram"/>
     <w:p>
       <w:pPr>
         <w:pStyle w:val="Heading3"/>
@@ -12170,6 +13142,48 @@
               <w:pStyle w:val="Compact"/>
               <w:jc w:val="center"/>
             </w:pPr>
+            <w:r>
+              <w:drawing>
+                <wp:inline>
+                  <wp:extent cx="5334000" cy="1717509"/>
+                  <wp:effectExtent b="0" l="0" r="0" t="0"/>
+                  <wp:docPr descr="" title="" id="191" name="Picture"/>
+                  <a:graphic>
+                    <a:graphicData uri="http://schemas.openxmlformats.org/drawingml/2006/picture">
+                      <pic:pic>
+                        <pic:nvPicPr>
+                          <pic:cNvPr descr="Figures/mermaid_flow_diagram_02.png" id="192" name="Picture"/>
+                          <pic:cNvPicPr>
+                            <a:picLocks noChangeArrowheads="1" noChangeAspect="1"/>
+                          </pic:cNvPicPr>
+                        </pic:nvPicPr>
+                        <pic:blipFill>
+                          <a:blip r:embed="rId190"/>
+                          <a:stretch>
+                            <a:fillRect/>
+                          </a:stretch>
+                        </pic:blipFill>
+                        <pic:spPr bwMode="auto">
+                          <a:xfrm>
+                            <a:off x="0" y="0"/>
+                            <a:ext cx="5334000" cy="1717509"/>
+                          </a:xfrm>
+                          <a:prstGeom prst="rect">
+                            <a:avLst/>
+                          </a:prstGeom>
+                          <a:noFill/>
+                          <a:ln w="9525">
+                            <a:noFill/>
+                            <a:headEnd/>
+                            <a:tailEnd/>
+                          </a:ln>
+                        </pic:spPr>
+                      </pic:pic>
+                    </a:graphicData>
+                  </a:graphic>
+                </wp:inline>
+              </w:drawing>
+            </w:r>
           </w:p>
         </w:tc>
       </w:tr>
@@ -12434,8 +13448,8 @@
         <w:t xml:space="preserve">.</w:t>
       </w:r>
     </w:p>
-    <w:bookmarkEnd w:id="123"/>
-    <w:bookmarkStart w:id="124" w:name="latex-figure-version"/>
+    <w:bookmarkEnd w:id="193"/>
+    <w:bookmarkStart w:id="196" w:name="latex-figure-version"/>
     <w:p>
       <w:pPr>
         <w:pStyle w:val="Heading3"/>
@@ -12470,6 +13484,48 @@
               <w:pStyle w:val="Compact"/>
               <w:jc w:val="center"/>
             </w:pPr>
+            <w:r>
+              <w:drawing>
+                <wp:inline>
+                  <wp:extent cx="5334000" cy="323564"/>
+                  <wp:effectExtent b="0" l="0" r="0" t="0"/>
+                  <wp:docPr descr="" title="" id="194" name="Picture"/>
+                  <a:graphic>
+                    <a:graphicData uri="http://schemas.openxmlformats.org/drawingml/2006/picture">
+                      <pic:pic>
+                        <pic:nvPicPr>
+                          <pic:cNvPr descr="Figures/mermaid_flow_diagram_01.png" id="195" name="Picture"/>
+                          <pic:cNvPicPr>
+                            <a:picLocks noChangeArrowheads="1" noChangeAspect="1"/>
+                          </pic:cNvPicPr>
+                        </pic:nvPicPr>
+                        <pic:blipFill>
+                          <a:blip r:embed="rId186"/>
+                          <a:stretch>
+                            <a:fillRect/>
+                          </a:stretch>
+                        </pic:blipFill>
+                        <pic:spPr bwMode="auto">
+                          <a:xfrm>
+                            <a:off x="0" y="0"/>
+                            <a:ext cx="5334000" cy="323564"/>
+                          </a:xfrm>
+                          <a:prstGeom prst="rect">
+                            <a:avLst/>
+                          </a:prstGeom>
+                          <a:noFill/>
+                          <a:ln w="9525">
+                            <a:noFill/>
+                            <a:headEnd/>
+                            <a:tailEnd/>
+                          </a:ln>
+                        </pic:spPr>
+                      </pic:pic>
+                    </a:graphicData>
+                  </a:graphic>
+                </wp:inline>
+              </w:drawing>
+            </w:r>
           </w:p>
         </w:tc>
       </w:tr>
@@ -12482,8 +13538,8 @@
         <w:t xml:space="preserve">Appendix workflow from Bulk OCR to page-range-based LLM extraction and downstream ClimateBERT processing. The implemented flow begins with OCR expansion, continues with provider-specific ESG extraction over selected page ranges, and ends with ClimateBERT comparison over the extracted text layer.</w:t>
       </w:r>
     </w:p>
-    <w:bookmarkEnd w:id="124"/>
-    <w:bookmarkStart w:id="125" w:name="interpretation"/>
+    <w:bookmarkEnd w:id="196"/>
+    <w:bookmarkStart w:id="197" w:name="interpretation"/>
     <w:p>
       <w:pPr>
         <w:pStyle w:val="Heading3"/>
@@ -12500,8 +13556,8 @@
         <w:t xml:space="preserve">This diagram shows that ClimateBERT processing is not the first-stage ingestion tool. Instead, it is a downstream comparison or benchmark layer applied after OCR expansion and after page-range-based ESG extraction. That distinction is methodologically important because the thesis does not compare ClimateBERT directly against raw PDFs. It compares ClimateBERT-style predictions against the extracted text layer produced by the broader ESG pipeline.</w:t>
       </w:r>
     </w:p>
-    <w:bookmarkEnd w:id="125"/>
-    <w:bookmarkStart w:id="132" w:name="Xad5bd01233b446ad67b2a3527ed9884dc838f1e"/>
+    <w:bookmarkEnd w:id="197"/>
+    <w:bookmarkStart w:id="204" w:name="Xad5bd01233b446ad67b2a3527ed9884dc838f1e"/>
     <w:p>
       <w:pPr>
         <w:pStyle w:val="Heading3"/>
@@ -12622,7 +13678,7 @@
         <w:t xml:space="preserve">These prompt files share the same extraction target, but they differ in how much reasoning structure they impose before the final JSON output. The prompt family is summarized below so that the appendix makes clear that prompt variation is not cosmetic. It is one of the main experimental levers of the thesis.</w:t>
       </w:r>
     </w:p>
-    <w:bookmarkStart w:id="126" w:name="prompt-family-logic"/>
+    <w:bookmarkStart w:id="198" w:name="prompt-family-logic"/>
     <w:p>
       <w:pPr>
         <w:pStyle w:val="Heading4"/>
@@ -12631,8 +13687,8 @@
         <w:t xml:space="preserve">Prompt-Family Logic</w:t>
       </w:r>
     </w:p>
-    <w:bookmarkEnd w:id="126"/>
-    <w:bookmarkStart w:id="128" w:name="prompt-family-summary-table"/>
+    <w:bookmarkEnd w:id="198"/>
+    <w:bookmarkStart w:id="200" w:name="prompt-family-summary-table"/>
     <w:p>
       <w:pPr>
         <w:pStyle w:val="Heading4"/>
@@ -12641,7 +13697,7 @@
         <w:t xml:space="preserve">Prompt-Family Summary Table</w:t>
       </w:r>
     </w:p>
-    <w:bookmarkStart w:id="127" w:name="tab:tone-prompt-family-summary"/>
+    <w:bookmarkStart w:id="199" w:name="tab:tone-prompt-family-summary"/>
     <w:p>
       <w:pPr>
         <w:pStyle w:val="TableCaption"/>
@@ -13141,9 +14197,9 @@
         </w:tc>
       </w:tr>
     </w:tbl>
-    <w:bookmarkEnd w:id="127"/>
-    <w:bookmarkEnd w:id="128"/>
-    <w:bookmarkStart w:id="129" w:name="why-the-prompt-reasoning-matters"/>
+    <w:bookmarkEnd w:id="199"/>
+    <w:bookmarkEnd w:id="200"/>
+    <w:bookmarkStart w:id="201" w:name="why-the-prompt-reasoning-matters"/>
     <w:p>
       <w:pPr>
         <w:pStyle w:val="Heading4"/>
@@ -13212,8 +14268,8 @@
         <w:t xml:space="preserve">This ordering matters because many sustainability disclosures are future-oriented promises written in positive language. If the prompt does not explicitly disentangle tone from sentiment, the model can collapse a promise into a falsely positive achieved result. The tone prompts therefore use reasoning scaffolds to reduce this specific validity error.</w:t>
       </w:r>
     </w:p>
-    <w:bookmarkEnd w:id="129"/>
-    <w:bookmarkStart w:id="130" w:name="prompt-reasoning-description-by-family"/>
+    <w:bookmarkEnd w:id="201"/>
+    <w:bookmarkStart w:id="202" w:name="prompt-reasoning-description-by-family"/>
     <w:p>
       <w:pPr>
         <w:pStyle w:val="Heading4"/>
@@ -13276,8 +14332,8 @@
         <w:t xml:space="preserve">The chain-of-thought prompts explicitly instruct the model to segment text, identify ESG relevance, assign tone, then assign sentiment, while keeping the actual reasoning hidden from the final response. Their reasoning philosophy is procedural: a difficult extraction problem is decomposed into smaller internal steps so that tone and sentiment are less likely to be conflated. This is the most thesis-aligned prompt family because the research question depends on stable tone disentanglement rather than generic JSON completion alone.</w:t>
       </w:r>
     </w:p>
-    <w:bookmarkEnd w:id="130"/>
-    <w:bookmarkStart w:id="131" w:name="appendix-interpretation"/>
+    <w:bookmarkEnd w:id="202"/>
+    <w:bookmarkStart w:id="203" w:name="appendix-interpretation"/>
     <w:p>
       <w:pPr>
         <w:pStyle w:val="Heading4"/>
@@ -13294,10 +14350,10 @@
         <w:t xml:space="preserve">This prompt family should be read as a controlled prompt-engineering ladder rather than as six unrelated files. The zero-shot prompts test direct schema interpretability. The few-shot prompts test example anchoring. The chain-of-thought prompts test whether stepwise internal reasoning improves tone stability. That is why prompt variation in Chapter 4 is analytically meaningful: it probes whether the thesis contribution depends only on model choice or also on reasoning structure embedded in the prompt itself.</w:t>
       </w:r>
     </w:p>
-    <w:bookmarkEnd w:id="131"/>
-    <w:bookmarkEnd w:id="132"/>
-    <w:bookmarkEnd w:id="133"/>
-    <w:bookmarkStart w:id="189" w:name="json-data-examples"/>
+    <w:bookmarkEnd w:id="203"/>
+    <w:bookmarkEnd w:id="204"/>
+    <w:bookmarkEnd w:id="205"/>
+    <w:bookmarkStart w:id="261" w:name="json-data-examples"/>
     <w:p>
       <w:pPr>
         <w:pStyle w:val="Heading2"/>
@@ -13314,7 +14370,7 @@
         <w:t xml:space="preserve">The repository uses JSON extensively for OCR outputs, extraction records, dashboard artifacts, model caches, logs, and workflow decisions. This appendix section provides representative examples of the actual JSON structures used by the implemented system.</w:t>
       </w:r>
     </w:p>
-    <w:bookmarkStart w:id="134" w:name="ocr-output-json"/>
+    <w:bookmarkStart w:id="206" w:name="ocr-output-json"/>
     <w:p>
       <w:pPr>
         <w:pStyle w:val="Heading3"/>
@@ -13596,8 +14652,8 @@
         <w:t xml:space="preserve">}</w:t>
       </w:r>
     </w:p>
-    <w:bookmarkEnd w:id="134"/>
-    <w:bookmarkStart w:id="135" w:name="esg-extraction-run-json"/>
+    <w:bookmarkEnd w:id="206"/>
+    <w:bookmarkStart w:id="207" w:name="esg-extraction-run-json"/>
     <w:p>
       <w:pPr>
         <w:pStyle w:val="Heading3"/>
@@ -13986,8 +15042,8 @@
         <w:t xml:space="preserve">}</w:t>
       </w:r>
     </w:p>
-    <w:bookmarkEnd w:id="135"/>
-    <w:bookmarkStart w:id="136" w:name="climatebert-result-json"/>
+    <w:bookmarkEnd w:id="207"/>
+    <w:bookmarkStart w:id="208" w:name="climatebert-result-json"/>
     <w:p>
       <w:pPr>
         <w:pStyle w:val="Heading3"/>
@@ -14152,8 +15208,8 @@
         <w:t xml:space="preserve">}</w:t>
       </w:r>
     </w:p>
-    <w:bookmarkEnd w:id="136"/>
-    <w:bookmarkStart w:id="188" w:name="X0f67535efdb3993fe05efb15179f82819ddaa86"/>
+    <w:bookmarkEnd w:id="208"/>
+    <w:bookmarkStart w:id="260" w:name="X0f67535efdb3993fe05efb15179f82819ddaa86"/>
     <w:p>
       <w:pPr>
         <w:pStyle w:val="Heading3"/>
@@ -14371,8 +15427,8 @@
         <w:t xml:space="preserve">Together, these JSON families support benchmark generation, ontology mapping, workflow documentation, summarization inputs, transfer-learning dataset reporting, and interactive tooling. They form an important part of the repository’s reproducibility and audit layer even when they are not all directly cited in the main thesis chapters.</w:t>
       </w:r>
     </w:p>
-    <w:bookmarkStart w:id="187" w:name="refs"/>
-    <w:bookmarkStart w:id="138" w:name="ref-yavuz_k_l_n__64e32f80"/>
+    <w:bookmarkStart w:id="259" w:name="refs"/>
+    <w:bookmarkStart w:id="210" w:name="ref-yavuz_k_l_n__64e32f80"/>
     <w:p>
       <w:pPr>
         <w:pStyle w:val="Bibliography"/>
@@ -14402,7 +15458,7 @@
       <w:r>
         <w:t xml:space="preserve"> </w:t>
       </w:r>
-      <w:hyperlink r:id="rId137">
+      <w:hyperlink r:id="rId209">
         <w:r>
           <w:rPr>
             <w:rStyle w:val="Hyperlink"/>
@@ -14414,8 +15470,8 @@
         <w:t xml:space="preserve">.</w:t>
       </w:r>
     </w:p>
-    <w:bookmarkEnd w:id="138"/>
-    <w:bookmarkStart w:id="140" w:name="Xe59468f6899108dc9798d9a138e7bb835726a17"/>
+    <w:bookmarkEnd w:id="210"/>
+    <w:bookmarkStart w:id="212" w:name="Xe59468f6899108dc9798d9a138e7bb835726a17"/>
     <w:p>
       <w:pPr>
         <w:pStyle w:val="Bibliography"/>
@@ -14448,7 +15504,7 @@
       <w:r>
         <w:t xml:space="preserve"> </w:t>
       </w:r>
-      <w:hyperlink r:id="rId139">
+      <w:hyperlink r:id="rId211">
         <w:r>
           <w:rPr>
             <w:rStyle w:val="Hyperlink"/>
@@ -14460,8 +15516,8 @@
         <w:t xml:space="preserve">.</w:t>
       </w:r>
     </w:p>
-    <w:bookmarkEnd w:id="140"/>
-    <w:bookmarkStart w:id="142" w:name="ref-chong_xu_bff21576"/>
+    <w:bookmarkEnd w:id="212"/>
+    <w:bookmarkStart w:id="214" w:name="ref-chong_xu_bff21576"/>
     <w:p>
       <w:pPr>
         <w:pStyle w:val="Bibliography"/>
@@ -14491,7 +15547,7 @@
       <w:r>
         <w:t xml:space="preserve"> </w:t>
       </w:r>
-      <w:hyperlink r:id="rId141">
+      <w:hyperlink r:id="rId213">
         <w:r>
           <w:rPr>
             <w:rStyle w:val="Hyperlink"/>
@@ -14503,8 +15559,8 @@
         <w:t xml:space="preserve">.</w:t>
       </w:r>
     </w:p>
-    <w:bookmarkEnd w:id="142"/>
-    <w:bookmarkStart w:id="144" w:name="ref-arash_hajikhani_cbb2528f"/>
+    <w:bookmarkEnd w:id="214"/>
+    <w:bookmarkStart w:id="216" w:name="ref-arash_hajikhani_cbb2528f"/>
     <w:p>
       <w:pPr>
         <w:pStyle w:val="Bibliography"/>
@@ -14537,7 +15593,7 @@
       <w:r>
         <w:t xml:space="preserve"> </w:t>
       </w:r>
-      <w:hyperlink r:id="rId143">
+      <w:hyperlink r:id="rId215">
         <w:r>
           <w:rPr>
             <w:rStyle w:val="Hyperlink"/>
@@ -14549,8 +15605,8 @@
         <w:t xml:space="preserve">.</w:t>
       </w:r>
     </w:p>
-    <w:bookmarkEnd w:id="144"/>
-    <w:bookmarkStart w:id="146" w:name="ref-fabian_billert_a5fbb687"/>
+    <w:bookmarkEnd w:id="216"/>
+    <w:bookmarkStart w:id="218" w:name="ref-fabian_billert_a5fbb687"/>
     <w:p>
       <w:pPr>
         <w:pStyle w:val="Bibliography"/>
@@ -14580,7 +15636,7 @@
       <w:r>
         <w:t xml:space="preserve"> </w:t>
       </w:r>
-      <w:hyperlink r:id="rId145">
+      <w:hyperlink r:id="rId217">
         <w:r>
           <w:rPr>
             <w:rStyle w:val="Hyperlink"/>
@@ -14592,8 +15648,8 @@
         <w:t xml:space="preserve">.</w:t>
       </w:r>
     </w:p>
-    <w:bookmarkEnd w:id="146"/>
-    <w:bookmarkStart w:id="148" w:name="ref-frederik_maibaum_b8629037"/>
+    <w:bookmarkEnd w:id="218"/>
+    <w:bookmarkStart w:id="220" w:name="ref-frederik_maibaum_b8629037"/>
     <w:p>
       <w:pPr>
         <w:pStyle w:val="Bibliography"/>
@@ -14626,7 +15682,7 @@
       <w:r>
         <w:t xml:space="preserve"> </w:t>
       </w:r>
-      <w:hyperlink r:id="rId147">
+      <w:hyperlink r:id="rId219">
         <w:r>
           <w:rPr>
             <w:rStyle w:val="Hyperlink"/>
@@ -14638,8 +15694,8 @@
         <w:t xml:space="preserve">.</w:t>
       </w:r>
     </w:p>
-    <w:bookmarkEnd w:id="148"/>
-    <w:bookmarkStart w:id="150" w:name="ref-habiba_al_shaer_c2f5394b"/>
+    <w:bookmarkEnd w:id="220"/>
+    <w:bookmarkStart w:id="222" w:name="ref-habiba_al_shaer_c2f5394b"/>
     <w:p>
       <w:pPr>
         <w:pStyle w:val="Bibliography"/>
@@ -14672,7 +15728,7 @@
       <w:r>
         <w:t xml:space="preserve"> </w:t>
       </w:r>
-      <w:hyperlink r:id="rId149">
+      <w:hyperlink r:id="rId221">
         <w:r>
           <w:rPr>
             <w:rStyle w:val="Hyperlink"/>
@@ -14684,8 +15740,8 @@
         <w:t xml:space="preserve">.</w:t>
       </w:r>
     </w:p>
-    <w:bookmarkEnd w:id="150"/>
-    <w:bookmarkStart w:id="152" w:name="ref-marsdenia_010e13e7"/>
+    <w:bookmarkEnd w:id="222"/>
+    <w:bookmarkStart w:id="224" w:name="ref-marsdenia_010e13e7"/>
     <w:p>
       <w:pPr>
         <w:pStyle w:val="Bibliography"/>
@@ -14715,7 +15771,7 @@
       <w:r>
         <w:t xml:space="preserve"> </w:t>
       </w:r>
-      <w:hyperlink r:id="rId151">
+      <w:hyperlink r:id="rId223">
         <w:r>
           <w:rPr>
             <w:rStyle w:val="Hyperlink"/>
@@ -14727,8 +15783,8 @@
         <w:t xml:space="preserve">.</w:t>
       </w:r>
     </w:p>
-    <w:bookmarkEnd w:id="152"/>
-    <w:bookmarkStart w:id="154" w:name="ref-tae_sun_chung_e16a4c18"/>
+    <w:bookmarkEnd w:id="224"/>
+    <w:bookmarkStart w:id="226" w:name="ref-tae_sun_chung_e16a4c18"/>
     <w:p>
       <w:pPr>
         <w:pStyle w:val="Bibliography"/>
@@ -14758,7 +15814,7 @@
       <w:r>
         <w:t xml:space="preserve"> </w:t>
       </w:r>
-      <w:hyperlink r:id="rId153">
+      <w:hyperlink r:id="rId225">
         <w:r>
           <w:rPr>
             <w:rStyle w:val="Hyperlink"/>
@@ -14770,8 +15826,8 @@
         <w:t xml:space="preserve">.</w:t>
       </w:r>
     </w:p>
-    <w:bookmarkEnd w:id="154"/>
-    <w:bookmarkStart w:id="156" w:name="ref-tobias_schimanski_4e192ec5"/>
+    <w:bookmarkEnd w:id="226"/>
+    <w:bookmarkStart w:id="228" w:name="ref-tobias_schimanski_4e192ec5"/>
     <w:p>
       <w:pPr>
         <w:pStyle w:val="Bibliography"/>
@@ -14804,7 +15860,7 @@
       <w:r>
         <w:t xml:space="preserve"> </w:t>
       </w:r>
-      <w:hyperlink r:id="rId155">
+      <w:hyperlink r:id="rId227">
         <w:r>
           <w:rPr>
             <w:rStyle w:val="Hyperlink"/>
@@ -14816,8 +15872,8 @@
         <w:t xml:space="preserve">.</w:t>
       </w:r>
     </w:p>
-    <w:bookmarkEnd w:id="156"/>
-    <w:bookmarkStart w:id="158" w:name="ref-tobias_schimanski_3549ff9f"/>
+    <w:bookmarkEnd w:id="228"/>
+    <w:bookmarkStart w:id="230" w:name="ref-tobias_schimanski_3549ff9f"/>
     <w:p>
       <w:pPr>
         <w:pStyle w:val="Bibliography"/>
@@ -14847,7 +15903,7 @@
       <w:r>
         <w:t xml:space="preserve"> </w:t>
       </w:r>
-      <w:hyperlink r:id="rId157">
+      <w:hyperlink r:id="rId229">
         <w:r>
           <w:rPr>
             <w:rStyle w:val="Hyperlink"/>
@@ -14859,8 +15915,8 @@
         <w:t xml:space="preserve">.</w:t>
       </w:r>
     </w:p>
-    <w:bookmarkEnd w:id="158"/>
-    <w:bookmarkStart w:id="160" w:name="ref-tobias_schimanski_241ada20"/>
+    <w:bookmarkEnd w:id="230"/>
+    <w:bookmarkStart w:id="232" w:name="ref-tobias_schimanski_241ada20"/>
     <w:p>
       <w:pPr>
         <w:pStyle w:val="Bibliography"/>
@@ -14890,7 +15946,7 @@
       <w:r>
         <w:t xml:space="preserve"> </w:t>
       </w:r>
-      <w:hyperlink r:id="rId159">
+      <w:hyperlink r:id="rId231">
         <w:r>
           <w:rPr>
             <w:rStyle w:val="Hyperlink"/>
@@ -14902,8 +15958,8 @@
         <w:t xml:space="preserve">.</w:t>
       </w:r>
     </w:p>
-    <w:bookmarkEnd w:id="160"/>
-    <w:bookmarkStart w:id="162" w:name="ref-yinan_yu_e282fd98"/>
+    <w:bookmarkEnd w:id="232"/>
+    <w:bookmarkStart w:id="234" w:name="ref-yinan_yu_e282fd98"/>
     <w:p>
       <w:pPr>
         <w:pStyle w:val="Bibliography"/>
@@ -14936,7 +15992,7 @@
       <w:r>
         <w:t xml:space="preserve"> </w:t>
       </w:r>
-      <w:hyperlink r:id="rId161">
+      <w:hyperlink r:id="rId233">
         <w:r>
           <w:rPr>
             <w:rStyle w:val="Hyperlink"/>
@@ -14948,8 +16004,8 @@
         <w:t xml:space="preserve">.</w:t>
       </w:r>
     </w:p>
-    <w:bookmarkEnd w:id="162"/>
-    <w:bookmarkStart w:id="164" w:name="ref-keane_ong_0a5de439"/>
+    <w:bookmarkEnd w:id="234"/>
+    <w:bookmarkStart w:id="236" w:name="ref-keane_ong_0a5de439"/>
     <w:p>
       <w:pPr>
         <w:pStyle w:val="Bibliography"/>
@@ -14972,7 +16028,7 @@
       <w:r>
         <w:t xml:space="preserve"> </w:t>
       </w:r>
-      <w:hyperlink r:id="rId163">
+      <w:hyperlink r:id="rId235">
         <w:r>
           <w:rPr>
             <w:rStyle w:val="Hyperlink"/>
@@ -14984,8 +16040,8 @@
         <w:t xml:space="preserve">.</w:t>
       </w:r>
     </w:p>
-    <w:bookmarkEnd w:id="164"/>
-    <w:bookmarkStart w:id="166" w:name="ref-keane_ong_369a0b63"/>
+    <w:bookmarkEnd w:id="236"/>
+    <w:bookmarkStart w:id="238" w:name="ref-keane_ong_369a0b63"/>
     <w:p>
       <w:pPr>
         <w:pStyle w:val="Bibliography"/>
@@ -15015,7 +16071,7 @@
       <w:r>
         <w:t xml:space="preserve"> </w:t>
       </w:r>
-      <w:hyperlink r:id="rId165">
+      <w:hyperlink r:id="rId237">
         <w:r>
           <w:rPr>
             <w:rStyle w:val="Hyperlink"/>
@@ -15027,8 +16083,8 @@
         <w:t xml:space="preserve">.</w:t>
       </w:r>
     </w:p>
-    <w:bookmarkEnd w:id="166"/>
-    <w:bookmarkStart w:id="168" w:name="ref-keane_ong_8fec4760"/>
+    <w:bookmarkEnd w:id="238"/>
+    <w:bookmarkStart w:id="240" w:name="ref-keane_ong_8fec4760"/>
     <w:p>
       <w:pPr>
         <w:pStyle w:val="Bibliography"/>
@@ -15058,7 +16114,7 @@
       <w:r>
         <w:t xml:space="preserve"> </w:t>
       </w:r>
-      <w:hyperlink r:id="rId167">
+      <w:hyperlink r:id="rId239">
         <w:r>
           <w:rPr>
             <w:rStyle w:val="Hyperlink"/>
@@ -15070,8 +16126,8 @@
         <w:t xml:space="preserve">.</w:t>
       </w:r>
     </w:p>
-    <w:bookmarkEnd w:id="168"/>
-    <w:bookmarkStart w:id="170" w:name="ref-natraj_raman_009776f2"/>
+    <w:bookmarkEnd w:id="240"/>
+    <w:bookmarkStart w:id="242" w:name="ref-natraj_raman_009776f2"/>
     <w:p>
       <w:pPr>
         <w:pStyle w:val="Bibliography"/>
@@ -15104,7 +16160,7 @@
       <w:r>
         <w:t xml:space="preserve"> </w:t>
       </w:r>
-      <w:hyperlink r:id="rId169">
+      <w:hyperlink r:id="rId241">
         <w:r>
           <w:rPr>
             <w:rStyle w:val="Hyperlink"/>
@@ -15116,8 +16172,8 @@
         <w:t xml:space="preserve">.</w:t>
       </w:r>
     </w:p>
-    <w:bookmarkEnd w:id="170"/>
-    <w:bookmarkStart w:id="172" w:name="ref-s_s__george_b30d4b3e"/>
+    <w:bookmarkEnd w:id="242"/>
+    <w:bookmarkStart w:id="244" w:name="ref-s_s__george_b30d4b3e"/>
     <w:p>
       <w:pPr>
         <w:pStyle w:val="Bibliography"/>
@@ -15147,7 +16203,7 @@
       <w:r>
         <w:t xml:space="preserve"> </w:t>
       </w:r>
-      <w:hyperlink r:id="rId171">
+      <w:hyperlink r:id="rId243">
         <w:r>
           <w:rPr>
             <w:rStyle w:val="Hyperlink"/>
@@ -15159,8 +16215,8 @@
         <w:t xml:space="preserve">.</w:t>
       </w:r>
     </w:p>
-    <w:bookmarkEnd w:id="172"/>
-    <w:bookmarkStart w:id="174" w:name="ref-jacob_beck_9548a833"/>
+    <w:bookmarkEnd w:id="244"/>
+    <w:bookmarkStart w:id="246" w:name="ref-jacob_beck_9548a833"/>
     <w:p>
       <w:pPr>
         <w:pStyle w:val="Bibliography"/>
@@ -15193,7 +16249,7 @@
       <w:r>
         <w:t xml:space="preserve"> </w:t>
       </w:r>
-      <w:hyperlink r:id="rId173">
+      <w:hyperlink r:id="rId245">
         <w:r>
           <w:rPr>
             <w:rStyle w:val="Hyperlink"/>
@@ -15205,8 +16261,8 @@
         <w:t xml:space="preserve">.</w:t>
       </w:r>
     </w:p>
-    <w:bookmarkEnd w:id="174"/>
-    <w:bookmarkStart w:id="176" w:name="ref-siqi_sun_f6a51152"/>
+    <w:bookmarkEnd w:id="246"/>
+    <w:bookmarkStart w:id="248" w:name="ref-siqi_sun_f6a51152"/>
     <w:p>
       <w:pPr>
         <w:pStyle w:val="Bibliography"/>
@@ -15242,7 +16298,7 @@
       <w:r>
         <w:t xml:space="preserve"> </w:t>
       </w:r>
-      <w:hyperlink r:id="rId175">
+      <w:hyperlink r:id="rId247">
         <w:r>
           <w:rPr>
             <w:rStyle w:val="Hyperlink"/>
@@ -15254,8 +16310,8 @@
         <w:t xml:space="preserve">.</w:t>
       </w:r>
     </w:p>
-    <w:bookmarkEnd w:id="176"/>
-    <w:bookmarkStart w:id="178" w:name="ref-marco_bronzini_bf94d949"/>
+    <w:bookmarkEnd w:id="248"/>
+    <w:bookmarkStart w:id="250" w:name="ref-marco_bronzini_bf94d949"/>
     <w:p>
       <w:pPr>
         <w:pStyle w:val="Bibliography"/>
@@ -15288,7 +16344,7 @@
       <w:r>
         <w:t xml:space="preserve"> </w:t>
       </w:r>
-      <w:hyperlink r:id="rId177">
+      <w:hyperlink r:id="rId249">
         <w:r>
           <w:rPr>
             <w:rStyle w:val="Hyperlink"/>
@@ -15300,8 +16356,8 @@
         <w:t xml:space="preserve">.</w:t>
       </w:r>
     </w:p>
-    <w:bookmarkEnd w:id="178"/>
-    <w:bookmarkStart w:id="180" w:name="ref-desi_adhariani_543335d6"/>
+    <w:bookmarkEnd w:id="250"/>
+    <w:bookmarkStart w:id="252" w:name="ref-desi_adhariani_543335d6"/>
     <w:p>
       <w:pPr>
         <w:pStyle w:val="Bibliography"/>
@@ -15334,7 +16390,7 @@
       <w:r>
         <w:t xml:space="preserve"> </w:t>
       </w:r>
-      <w:hyperlink r:id="rId179">
+      <w:hyperlink r:id="rId251">
         <w:r>
           <w:rPr>
             <w:rStyle w:val="Hyperlink"/>
@@ -15346,8 +16402,8 @@
         <w:t xml:space="preserve">.</w:t>
       </w:r>
     </w:p>
-    <w:bookmarkEnd w:id="180"/>
-    <w:bookmarkStart w:id="182" w:name="ref-mariya_pavlova_259be499"/>
+    <w:bookmarkEnd w:id="252"/>
+    <w:bookmarkStart w:id="254" w:name="ref-mariya_pavlova_259be499"/>
     <w:p>
       <w:pPr>
         <w:pStyle w:val="Bibliography"/>
@@ -15377,7 +16433,7 @@
       <w:r>
         <w:t xml:space="preserve"> </w:t>
       </w:r>
-      <w:hyperlink r:id="rId181">
+      <w:hyperlink r:id="rId253">
         <w:r>
           <w:rPr>
             <w:rStyle w:val="Hyperlink"/>
@@ -15389,8 +16445,8 @@
         <w:t xml:space="preserve">.</w:t>
       </w:r>
     </w:p>
-    <w:bookmarkEnd w:id="182"/>
-    <w:bookmarkStart w:id="184" w:name="ref-julia_bingler_268445e3"/>
+    <w:bookmarkEnd w:id="254"/>
+    <w:bookmarkStart w:id="256" w:name="ref-julia_bingler_268445e3"/>
     <w:p>
       <w:pPr>
         <w:pStyle w:val="Bibliography"/>
@@ -15423,7 +16479,7 @@
       <w:r>
         <w:t xml:space="preserve"> </w:t>
       </w:r>
-      <w:hyperlink r:id="rId183">
+      <w:hyperlink r:id="rId255">
         <w:r>
           <w:rPr>
             <w:rStyle w:val="Hyperlink"/>
@@ -15435,8 +16491,8 @@
         <w:t xml:space="preserve">.</w:t>
       </w:r>
     </w:p>
-    <w:bookmarkEnd w:id="184"/>
-    <w:bookmarkStart w:id="186" w:name="ref-xiaojia_wang_02351a60"/>
+    <w:bookmarkEnd w:id="256"/>
+    <w:bookmarkStart w:id="258" w:name="ref-xiaojia_wang_02351a60"/>
     <w:p>
       <w:pPr>
         <w:pStyle w:val="Bibliography"/>
@@ -15469,7 +16525,7 @@
       <w:r>
         <w:t xml:space="preserve"> </w:t>
       </w:r>
-      <w:hyperlink r:id="rId185">
+      <w:hyperlink r:id="rId257">
         <w:r>
           <w:rPr>
             <w:rStyle w:val="Hyperlink"/>
@@ -15481,11 +16537,11 @@
         <w:t xml:space="preserve">.</w:t>
       </w:r>
     </w:p>
-    <w:bookmarkEnd w:id="186"/>
-    <w:bookmarkEnd w:id="187"/>
-    <w:bookmarkEnd w:id="188"/>
-    <w:bookmarkEnd w:id="189"/>
-    <w:bookmarkEnd w:id="190"/>
+    <w:bookmarkEnd w:id="258"/>
+    <w:bookmarkEnd w:id="259"/>
+    <w:bookmarkEnd w:id="260"/>
+    <w:bookmarkEnd w:id="261"/>
+    <w:bookmarkEnd w:id="262"/>
     <w:sectPr/>
   </w:body>
 </w:document>

</xml_diff>